<commit_message>
Made some changes in word file
</commit_message>
<xml_diff>
--- a/Report/zerowaste_business_plan.docx
+++ b/Report/zerowaste_business_plan.docx
@@ -1,6 +1,6 @@
 
 <file path=word/document.xml><?xml version="1.0" encoding="utf-8"?>
-<w:document xmlns:wpc="http://schemas.microsoft.com/office/word/2010/wordprocessingCanvas" xmlns:cx="http://schemas.microsoft.com/office/drawing/2014/chartex" xmlns:cx1="http://schemas.microsoft.com/office/drawing/2015/9/8/chartex" xmlns:cx2="http://schemas.microsoft.com/office/drawing/2015/10/21/chartex" xmlns:cx3="http://schemas.microsoft.com/office/drawing/2016/5/9/chartex" xmlns:cx4="http://schemas.microsoft.com/office/drawing/2016/5/10/chartex" xmlns:cx5="http://schemas.microsoft.com/office/drawing/2016/5/11/chartex" xmlns:cx6="http://schemas.microsoft.com/office/drawing/2016/5/12/chartex" xmlns:cx7="http://schemas.microsoft.com/office/drawing/2016/5/13/chartex" xmlns:cx8="http://schemas.microsoft.com/office/drawing/2016/5/14/chartex" xmlns:mc="http://schemas.openxmlformats.org/markup-compatibility/2006" xmlns:aink="http://schemas.microsoft.com/office/drawing/2016/ink" xmlns:am3d="http://schemas.microsoft.com/office/drawing/2017/model3d" xmlns:o="urn:schemas-microsoft-com:office:office" xmlns:oel="http://schemas.microsoft.com/office/2019/extlst" xmlns:r="http://schemas.openxmlformats.org/officeDocument/2006/relationships" xmlns:m="http://schemas.openxmlformats.org/officeDocument/2006/math" xmlns:v="urn:schemas-microsoft-com:vml" xmlns:wp14="http://schemas.microsoft.com/office/word/2010/wordprocessingDrawing" xmlns:wp="http://schemas.openxmlformats.org/drawingml/2006/wordprocessingDrawing" xmlns:w10="urn:schemas-microsoft-com:office:word" xmlns:w="http://schemas.openxmlformats.org/wordprocessingml/2006/main" xmlns:w14="http://schemas.microsoft.com/office/word/2010/wordml" xmlns:w15="http://schemas.microsoft.com/office/word/2012/wordml" xmlns:w16cex="http://schemas.microsoft.com/office/word/2018/wordml/cex" xmlns:w16cid="http://schemas.microsoft.com/office/word/2016/wordml/cid" xmlns:w16="http://schemas.microsoft.com/office/word/2018/wordml" xmlns:w16du="http://schemas.microsoft.com/office/word/2023/wordml/word16du" xmlns:w16sdtdh="http://schemas.microsoft.com/office/word/2020/wordml/sdtdatahash" xmlns:w16sdtfl="http://schemas.microsoft.com/office/word/2024/wordml/sdtformatlock" xmlns:w16se="http://schemas.microsoft.com/office/word/2015/wordml/symex" xmlns:wpg="http://schemas.microsoft.com/office/word/2010/wordprocessingGroup" xmlns:wpi="http://schemas.microsoft.com/office/word/2010/wordprocessingInk" xmlns:wne="http://schemas.microsoft.com/office/word/2006/wordml" xmlns:wps="http://schemas.microsoft.com/office/word/2010/wordprocessingShape" mc:Ignorable="w14 w15 w16se w16cid w16 w16cex w16sdtdh w16sdtfl w16du wp14">
+<w:document xmlns:wpc="http://schemas.microsoft.com/office/word/2010/wordprocessingCanvas" xmlns:cx="http://schemas.microsoft.com/office/drawing/2014/chartex" xmlns:cx1="http://schemas.microsoft.com/office/drawing/2015/9/8/chartex" xmlns:cx2="http://schemas.microsoft.com/office/drawing/2015/10/21/chartex" xmlns:cx3="http://schemas.microsoft.com/office/drawing/2016/5/9/chartex" xmlns:cx4="http://schemas.microsoft.com/office/drawing/2016/5/10/chartex" xmlns:cx5="http://schemas.microsoft.com/office/drawing/2016/5/11/chartex" xmlns:cx6="http://schemas.microsoft.com/office/drawing/2016/5/12/chartex" xmlns:cx7="http://schemas.microsoft.com/office/drawing/2016/5/13/chartex" xmlns:cx8="http://schemas.microsoft.com/office/drawing/2016/5/14/chartex" xmlns:mc="http://schemas.openxmlformats.org/markup-compatibility/2006" xmlns:aink="http://schemas.microsoft.com/office/drawing/2016/ink" xmlns:am3d="http://schemas.microsoft.com/office/drawing/2017/model3d" xmlns:o="urn:schemas-microsoft-com:office:office" xmlns:oel="http://schemas.microsoft.com/office/2019/extlst" xmlns:r="http://schemas.openxmlformats.org/officeDocument/2006/relationships" xmlns:m="http://schemas.openxmlformats.org/officeDocument/2006/math" xmlns:v="urn:schemas-microsoft-com:vml" xmlns:wp14="http://schemas.microsoft.com/office/word/2010/wordprocessingDrawing" xmlns:wp="http://schemas.openxmlformats.org/drawingml/2006/wordprocessingDrawing" xmlns:w10="urn:schemas-microsoft-com:office:word" xmlns:w="http://schemas.openxmlformats.org/wordprocessingml/2006/main" xmlns:w14="http://schemas.microsoft.com/office/word/2010/wordml" xmlns:w15="http://schemas.microsoft.com/office/word/2012/wordml" xmlns:w16cex="http://schemas.microsoft.com/office/word/2018/wordml/cex" xmlns:w16cid="http://schemas.microsoft.com/office/word/2016/wordml/cid" xmlns:w16="http://schemas.microsoft.com/office/word/2018/wordml" xmlns:w16sdtdh="http://schemas.microsoft.com/office/word/2020/wordml/sdtdatahash" xmlns:w16se="http://schemas.microsoft.com/office/word/2015/wordml/symex" xmlns:wpg="http://schemas.microsoft.com/office/word/2010/wordprocessingGroup" xmlns:wpi="http://schemas.microsoft.com/office/word/2010/wordprocessingInk" xmlns:wne="http://schemas.microsoft.com/office/word/2006/wordml" xmlns:wps="http://schemas.microsoft.com/office/word/2010/wordprocessingShape" mc:Ignorable="w14 w15 w16se w16cid w16 w16cex w16sdtdh wp14">
   <w:body>
     <w:p>
       <w:pPr>
@@ -863,16 +863,8 @@
               <w:rPr>
                 <w:rFonts w:eastAsia="Calibri"/>
               </w:rPr>
-              <w:t xml:space="preserve">Assignment 1 – Task </w:t>
-            </w:r>
-            <w:proofErr w:type="gramStart"/>
-            <w:r>
-              <w:rPr>
-                <w:rFonts w:eastAsia="Calibri"/>
-              </w:rPr>
-              <w:t>1</w:t>
-            </w:r>
-            <w:proofErr w:type="gramEnd"/>
+              <w:t>Assignment 1 – Task 1</w:t>
+            </w:r>
           </w:p>
         </w:tc>
         <w:tc>
@@ -1831,21 +1823,12 @@
                 <w:b/>
               </w:rPr>
             </w:pPr>
-            <w:proofErr w:type="gramStart"/>
             <w:r>
               <w:rPr>
                 <w:rFonts w:eastAsia="Calibri"/>
                 <w:b/>
               </w:rPr>
-              <w:t>Student</w:t>
-            </w:r>
-            <w:proofErr w:type="gramEnd"/>
-            <w:r>
-              <w:rPr>
-                <w:rFonts w:eastAsia="Calibri"/>
-                <w:b/>
-              </w:rPr>
-              <w:t xml:space="preserve"> acknowledge feedback/comments</w:t>
+              <w:t>Student acknowledge feedback/comments</w:t>
             </w:r>
           </w:p>
         </w:tc>
@@ -2092,25 +2075,7 @@
           <w:sz w:val="18"/>
           <w:szCs w:val="18"/>
         </w:rPr>
-        <w:t xml:space="preserve">If the Turnitin report is required, students </w:t>
-      </w:r>
-      <w:proofErr w:type="gramStart"/>
-      <w:r>
-        <w:rPr>
-          <w:rFonts w:eastAsia="Calibri" w:cs="Times New Roman"/>
-          <w:sz w:val="18"/>
-          <w:szCs w:val="18"/>
-        </w:rPr>
-        <w:t>have to</w:t>
-      </w:r>
-      <w:proofErr w:type="gramEnd"/>
-      <w:r>
-        <w:rPr>
-          <w:rFonts w:eastAsia="Calibri" w:cs="Times New Roman"/>
-          <w:sz w:val="18"/>
-          <w:szCs w:val="18"/>
-        </w:rPr>
-        <w:t xml:space="preserve"> submit it with the assignment. However, departments may allow students up to </w:t>
+        <w:t xml:space="preserve">If the Turnitin report is required, students have to submit it with the assignment. However, departments may allow students up to </w:t>
       </w:r>
       <w:r>
         <w:rPr>
@@ -9738,6 +9703,7 @@
       <w:r>
         <w:rPr>
           <w:rFonts w:cs="Times New Roman"/>
+          <w:noProof/>
         </w:rPr>
         <w:drawing>
           <wp:inline distT="0" distB="0" distL="0" distR="0" wp14:anchorId="7260416B" wp14:editId="01262268">
@@ -9850,14 +9816,14 @@
       <w:r>
         <w:rPr>
           <w:rFonts w:cs="Times New Roman"/>
-          <w:lang w:val="en-US"/>
+          <w:noProof/>
         </w:rPr>
         <w:lastRenderedPageBreak/>
         <w:drawing>
-          <wp:inline distT="0" distB="0" distL="0" distR="0" wp14:anchorId="35B0D168" wp14:editId="520E6C1B">
-            <wp:extent cx="5731510" cy="4008755"/>
-            <wp:effectExtent l="0" t="0" r="2540" b="0"/>
-            <wp:docPr id="2016050178" name="Picture 1"/>
+          <wp:inline distT="0" distB="0" distL="0" distR="0" wp14:anchorId="5E081FEC" wp14:editId="2B807D9B">
+            <wp:extent cx="5885180" cy="3804128"/>
+            <wp:effectExtent l="0" t="0" r="1270" b="6350"/>
+            <wp:docPr id="6" name="Picture 6"/>
             <wp:cNvGraphicFramePr>
               <a:graphicFrameLocks xmlns:a="http://schemas.openxmlformats.org/drawingml/2006/main" noChangeAspect="1"/>
             </wp:cNvGraphicFramePr>
@@ -9865,23 +9831,33 @@
               <a:graphicData uri="http://schemas.openxmlformats.org/drawingml/2006/picture">
                 <pic:pic xmlns:pic="http://schemas.openxmlformats.org/drawingml/2006/picture">
                   <pic:nvPicPr>
-                    <pic:cNvPr id="2016050178" name=""/>
-                    <pic:cNvPicPr/>
+                    <pic:cNvPr id="0" name="Picture 3"/>
+                    <pic:cNvPicPr>
+                      <a:picLocks noChangeAspect="1" noChangeArrowheads="1"/>
+                    </pic:cNvPicPr>
                   </pic:nvPicPr>
                   <pic:blipFill>
-                    <a:blip r:embed="rId18"/>
+                    <a:blip r:embed="rId18">
+                      <a:extLst>
+                        <a:ext uri="{28A0092B-C50C-407E-A947-70E740481C1C}">
+                          <a14:useLocalDpi xmlns:a14="http://schemas.microsoft.com/office/drawing/2010/main" val="0"/>
+                        </a:ext>
+                      </a:extLst>
+                    </a:blip>
+                    <a:srcRect/>
                     <a:stretch>
                       <a:fillRect/>
                     </a:stretch>
                   </pic:blipFill>
-                  <pic:spPr>
+                  <pic:spPr bwMode="auto">
                     <a:xfrm>
                       <a:off x="0" y="0"/>
-                      <a:ext cx="5731510" cy="4008755"/>
+                      <a:ext cx="6094125" cy="3939188"/>
                     </a:xfrm>
                     <a:prstGeom prst="rect">
                       <a:avLst/>
                     </a:prstGeom>
+                    <a:noFill/>
                   </pic:spPr>
                 </pic:pic>
               </a:graphicData>
@@ -9954,12 +9930,13 @@
       <w:r>
         <w:rPr>
           <w:rFonts w:cs="Times New Roman"/>
+          <w:noProof/>
         </w:rPr>
         <w:drawing>
-          <wp:inline distT="0" distB="0" distL="0" distR="0" wp14:anchorId="10B4C3BD" wp14:editId="560262D0">
-            <wp:extent cx="5731510" cy="2673985"/>
-            <wp:effectExtent l="0" t="0" r="2540" b="0"/>
-            <wp:docPr id="2086330079" name="Picture 1"/>
+          <wp:inline distT="0" distB="0" distL="0" distR="0" wp14:anchorId="6E3268EB" wp14:editId="50B16005">
+            <wp:extent cx="5943600" cy="2604041"/>
+            <wp:effectExtent l="0" t="0" r="0" b="6350"/>
+            <wp:docPr id="8" name="Picture 8"/>
             <wp:cNvGraphicFramePr>
               <a:graphicFrameLocks xmlns:a="http://schemas.openxmlformats.org/drawingml/2006/main" noChangeAspect="1"/>
             </wp:cNvGraphicFramePr>
@@ -9967,23 +9944,33 @@
               <a:graphicData uri="http://schemas.openxmlformats.org/drawingml/2006/picture">
                 <pic:pic xmlns:pic="http://schemas.openxmlformats.org/drawingml/2006/picture">
                   <pic:nvPicPr>
-                    <pic:cNvPr id="2086330079" name=""/>
-                    <pic:cNvPicPr/>
+                    <pic:cNvPr id="0" name="Picture 4"/>
+                    <pic:cNvPicPr>
+                      <a:picLocks noChangeAspect="1" noChangeArrowheads="1"/>
+                    </pic:cNvPicPr>
                   </pic:nvPicPr>
                   <pic:blipFill>
-                    <a:blip r:embed="rId19"/>
+                    <a:blip r:embed="rId19" cstate="print">
+                      <a:extLst>
+                        <a:ext uri="{28A0092B-C50C-407E-A947-70E740481C1C}">
+                          <a14:useLocalDpi xmlns:a14="http://schemas.microsoft.com/office/drawing/2010/main" val="0"/>
+                        </a:ext>
+                      </a:extLst>
+                    </a:blip>
+                    <a:srcRect/>
                     <a:stretch>
                       <a:fillRect/>
                     </a:stretch>
                   </pic:blipFill>
-                  <pic:spPr>
+                  <pic:spPr bwMode="auto">
                     <a:xfrm>
                       <a:off x="0" y="0"/>
-                      <a:ext cx="5731510" cy="2673985"/>
+                      <a:ext cx="6023347" cy="2638980"/>
                     </a:xfrm>
                     <a:prstGeom prst="rect">
                       <a:avLst/>
                     </a:prstGeom>
+                    <a:noFill/>
                   </pic:spPr>
                 </pic:pic>
               </a:graphicData>
@@ -10056,6 +10043,7 @@
       <w:r>
         <w:rPr>
           <w:rFonts w:cs="Times New Roman"/>
+          <w:noProof/>
           <w:lang w:val="en-US"/>
         </w:rPr>
         <w:lastRenderedPageBreak/>
@@ -10348,6 +10336,15 @@
     </w:p>
     <w:p>
       <w:pPr>
+        <w:spacing w:line="360" w:lineRule="auto"/>
+        <w:jc w:val="both"/>
+        <w:rPr>
+          <w:rFonts w:cs="Times New Roman"/>
+        </w:rPr>
+      </w:pPr>
+    </w:p>
+    <w:p>
+      <w:pPr>
         <w:pStyle w:val="Style1"/>
         <w:rPr>
           <w:rFonts w:cs="Times New Roman"/>
@@ -10408,6 +10405,7 @@
           <w:sz w:val="20"/>
           <w:szCs w:val="20"/>
         </w:rPr>
+        <w:lastRenderedPageBreak/>
         <w:t xml:space="preserve">Note: The chart was created using GanttProject, and </w:t>
       </w:r>
       <w:r>
@@ -10463,7 +10461,6 @@
         <w:rPr>
           <w:rFonts w:cs="Times New Roman"/>
         </w:rPr>
-        <w:lastRenderedPageBreak/>
         <w:t>Technical Description</w:t>
       </w:r>
       <w:bookmarkEnd w:id="30"/>
@@ -11147,6 +11144,7 @@
                 <w:b/>
                 <w:bCs/>
               </w:rPr>
+              <w:lastRenderedPageBreak/>
               <w:t>Project Management and Collaboration</w:t>
             </w:r>
           </w:p>
@@ -11168,7 +11166,6 @@
               <w:rPr>
                 <w:rFonts w:cs="Times New Roman"/>
               </w:rPr>
-              <w:lastRenderedPageBreak/>
               <w:t>Version Control</w:t>
             </w:r>
           </w:p>
@@ -11569,7 +11566,7 @@
               <w:rPr>
                 <w:rFonts w:cs="Times New Roman"/>
               </w:rPr>
-              <w:t>CSS</w:t>
+              <w:t>Bootstrap</w:t>
             </w:r>
           </w:p>
         </w:tc>
@@ -11588,7 +11585,7 @@
               <w:rPr>
                 <w:rFonts w:cs="Times New Roman"/>
               </w:rPr>
-              <w:t>CSS4 or CSS5</w:t>
+              <w:t>Latest</w:t>
             </w:r>
           </w:p>
         </w:tc>
@@ -11674,7 +11671,7 @@
               <w:rPr>
                 <w:rFonts w:cs="Times New Roman"/>
               </w:rPr>
-              <w:t>Java Spring Boot</w:t>
+              <w:t>Spring Boot</w:t>
             </w:r>
           </w:p>
         </w:tc>
@@ -11693,7 +11690,7 @@
               <w:rPr>
                 <w:rFonts w:cs="Times New Roman"/>
               </w:rPr>
-              <w:t>3</w:t>
+              <w:t>Latest</w:t>
             </w:r>
           </w:p>
         </w:tc>
@@ -12360,12 +12357,115 @@
           </w:tcPr>
           <w:p>
             <w:pPr>
-              <w:spacing w:line="360" w:lineRule="auto"/>
-              <w:rPr>
-                <w:rFonts w:cs="Times New Roman"/>
-                <w:lang w:val="en-US"/>
-              </w:rPr>
-            </w:pPr>
+              <w:pStyle w:val="ListParagraph"/>
+              <w:numPr>
+                <w:ilvl w:val="0"/>
+                <w:numId w:val="29"/>
+              </w:numPr>
+              <w:spacing w:after="160" w:line="360" w:lineRule="auto"/>
+              <w:rPr>
+                <w:rFonts w:cs="Times New Roman"/>
+                <w:lang w:val="it-IT"/>
+              </w:rPr>
+            </w:pPr>
+            <w:r>
+              <w:rPr>
+                <w:rFonts w:cs="Times New Roman"/>
+                <w:lang w:val="it-IT"/>
+              </w:rPr>
+              <w:t>AMD Ryzen 5 5500U</w:t>
+            </w:r>
+          </w:p>
+          <w:p>
+            <w:pPr>
+              <w:pStyle w:val="ListParagraph"/>
+              <w:numPr>
+                <w:ilvl w:val="0"/>
+                <w:numId w:val="29"/>
+              </w:numPr>
+              <w:spacing w:after="160" w:line="360" w:lineRule="auto"/>
+              <w:rPr>
+                <w:rFonts w:cs="Times New Roman"/>
+                <w:lang w:val="it-IT"/>
+              </w:rPr>
+            </w:pPr>
+            <w:r>
+              <w:rPr>
+                <w:rFonts w:cs="Times New Roman"/>
+                <w:lang w:val="it-IT"/>
+              </w:rPr>
+              <w:t>16 GB RAM</w:t>
+            </w:r>
+          </w:p>
+          <w:p>
+            <w:pPr>
+              <w:pStyle w:val="ListParagraph"/>
+              <w:numPr>
+                <w:ilvl w:val="0"/>
+                <w:numId w:val="29"/>
+              </w:numPr>
+              <w:spacing w:after="160" w:line="360" w:lineRule="auto"/>
+              <w:rPr>
+                <w:rFonts w:cs="Times New Roman"/>
+                <w:lang w:val="it-IT"/>
+              </w:rPr>
+            </w:pPr>
+            <w:r>
+              <w:rPr>
+                <w:rFonts w:cs="Times New Roman"/>
+                <w:lang w:val="it-IT"/>
+              </w:rPr>
+              <w:t>8</w:t>
+            </w:r>
+            <w:r>
+              <w:rPr>
+                <w:rFonts w:cs="Times New Roman"/>
+                <w:lang w:val="it-IT"/>
+              </w:rPr>
+              <w:t xml:space="preserve"> GB </w:t>
+            </w:r>
+            <w:r>
+              <w:rPr>
+                <w:rFonts w:cs="Times New Roman"/>
+                <w:lang w:val="it-IT"/>
+              </w:rPr>
+              <w:t>-</w:t>
+            </w:r>
+            <w:r>
+              <w:rPr>
+                <w:rFonts w:cs="Times New Roman"/>
+                <w:lang w:val="it-IT"/>
+              </w:rPr>
+              <w:t xml:space="preserve"> </w:t>
+            </w:r>
+            <w:r>
+              <w:rPr>
+                <w:rFonts w:cs="Times New Roman"/>
+                <w:lang w:val="it-IT"/>
+              </w:rPr>
+              <w:t>GTX 1650</w:t>
+            </w:r>
+          </w:p>
+          <w:p>
+            <w:pPr>
+              <w:pStyle w:val="ListParagraph"/>
+              <w:numPr>
+                <w:ilvl w:val="0"/>
+                <w:numId w:val="29"/>
+              </w:numPr>
+              <w:spacing w:after="160" w:line="360" w:lineRule="auto"/>
+              <w:rPr>
+                <w:rFonts w:cs="Times New Roman"/>
+                <w:lang w:val="it-IT"/>
+              </w:rPr>
+            </w:pPr>
+            <w:r>
+              <w:rPr>
+                <w:rFonts w:cs="Times New Roman"/>
+                <w:lang w:val="it-IT"/>
+              </w:rPr>
+              <w:t>512 SSD</w:t>
+            </w:r>
           </w:p>
         </w:tc>
       </w:tr>
@@ -12736,23 +12836,7 @@
                 <w:rFonts w:cs="Times New Roman"/>
                 <w:lang w:val="en-US"/>
               </w:rPr>
-              <w:t xml:space="preserve">Second choice of browser to </w:t>
-            </w:r>
-            <w:proofErr w:type="gramStart"/>
-            <w:r>
-              <w:rPr>
-                <w:rFonts w:cs="Times New Roman"/>
-                <w:lang w:val="en-US"/>
-              </w:rPr>
-              <w:t>test</w:t>
-            </w:r>
-            <w:proofErr w:type="gramEnd"/>
-            <w:r>
-              <w:rPr>
-                <w:rFonts w:cs="Times New Roman"/>
-                <w:lang w:val="en-US"/>
-              </w:rPr>
-              <w:t xml:space="preserve"> for cross platform compatibility.</w:t>
+              <w:t>Second choice of browser to test for cross platform compatibility.</w:t>
             </w:r>
           </w:p>
         </w:tc>
@@ -12840,7 +12924,6 @@
               </w:rPr>
               <w:t xml:space="preserve">For running the backend and frontend application on local server </w:t>
             </w:r>
-            <w:proofErr w:type="gramStart"/>
             <w:r>
               <w:rPr>
                 <w:rFonts w:cs="Times New Roman"/>
@@ -12848,7 +12931,6 @@
               </w:rPr>
               <w:t>i.e.</w:t>
             </w:r>
-            <w:proofErr w:type="gramEnd"/>
             <w:r>
               <w:rPr>
                 <w:rFonts w:cs="Times New Roman"/>
@@ -14126,7 +14208,7 @@
 </file>
 
 <file path=word/endnotes.xml><?xml version="1.0" encoding="utf-8"?>
-<w:endnotes xmlns:wpc="http://schemas.microsoft.com/office/word/2010/wordprocessingCanvas" xmlns:cx="http://schemas.microsoft.com/office/drawing/2014/chartex" xmlns:cx1="http://schemas.microsoft.com/office/drawing/2015/9/8/chartex" xmlns:cx2="http://schemas.microsoft.com/office/drawing/2015/10/21/chartex" xmlns:cx3="http://schemas.microsoft.com/office/drawing/2016/5/9/chartex" xmlns:cx4="http://schemas.microsoft.com/office/drawing/2016/5/10/chartex" xmlns:cx5="http://schemas.microsoft.com/office/drawing/2016/5/11/chartex" xmlns:cx6="http://schemas.microsoft.com/office/drawing/2016/5/12/chartex" xmlns:cx7="http://schemas.microsoft.com/office/drawing/2016/5/13/chartex" xmlns:cx8="http://schemas.microsoft.com/office/drawing/2016/5/14/chartex" xmlns:mc="http://schemas.openxmlformats.org/markup-compatibility/2006" xmlns:aink="http://schemas.microsoft.com/office/drawing/2016/ink" xmlns:am3d="http://schemas.microsoft.com/office/drawing/2017/model3d" xmlns:o="urn:schemas-microsoft-com:office:office" xmlns:oel="http://schemas.microsoft.com/office/2019/extlst" xmlns:r="http://schemas.openxmlformats.org/officeDocument/2006/relationships" xmlns:m="http://schemas.openxmlformats.org/officeDocument/2006/math" xmlns:v="urn:schemas-microsoft-com:vml" xmlns:wp14="http://schemas.microsoft.com/office/word/2010/wordprocessingDrawing" xmlns:wp="http://schemas.openxmlformats.org/drawingml/2006/wordprocessingDrawing" xmlns:w10="urn:schemas-microsoft-com:office:word" xmlns:w="http://schemas.openxmlformats.org/wordprocessingml/2006/main" xmlns:w14="http://schemas.microsoft.com/office/word/2010/wordml" xmlns:w15="http://schemas.microsoft.com/office/word/2012/wordml" xmlns:w16cex="http://schemas.microsoft.com/office/word/2018/wordml/cex" xmlns:w16cid="http://schemas.microsoft.com/office/word/2016/wordml/cid" xmlns:w16="http://schemas.microsoft.com/office/word/2018/wordml" xmlns:w16du="http://schemas.microsoft.com/office/word/2023/wordml/word16du" xmlns:w16sdtdh="http://schemas.microsoft.com/office/word/2020/wordml/sdtdatahash" xmlns:w16sdtfl="http://schemas.microsoft.com/office/word/2024/wordml/sdtformatlock" xmlns:w16se="http://schemas.microsoft.com/office/word/2015/wordml/symex" xmlns:wpg="http://schemas.microsoft.com/office/word/2010/wordprocessingGroup" xmlns:wpi="http://schemas.microsoft.com/office/word/2010/wordprocessingInk" xmlns:wne="http://schemas.microsoft.com/office/word/2006/wordml" xmlns:wps="http://schemas.microsoft.com/office/word/2010/wordprocessingShape" mc:Ignorable="w14 w15 w16se w16cid w16 w16cex w16sdtdh w16sdtfl w16du wp14">
+<w:endnotes xmlns:wpc="http://schemas.microsoft.com/office/word/2010/wordprocessingCanvas" xmlns:cx="http://schemas.microsoft.com/office/drawing/2014/chartex" xmlns:cx1="http://schemas.microsoft.com/office/drawing/2015/9/8/chartex" xmlns:cx2="http://schemas.microsoft.com/office/drawing/2015/10/21/chartex" xmlns:cx3="http://schemas.microsoft.com/office/drawing/2016/5/9/chartex" xmlns:cx4="http://schemas.microsoft.com/office/drawing/2016/5/10/chartex" xmlns:cx5="http://schemas.microsoft.com/office/drawing/2016/5/11/chartex" xmlns:cx6="http://schemas.microsoft.com/office/drawing/2016/5/12/chartex" xmlns:cx7="http://schemas.microsoft.com/office/drawing/2016/5/13/chartex" xmlns:cx8="http://schemas.microsoft.com/office/drawing/2016/5/14/chartex" xmlns:mc="http://schemas.openxmlformats.org/markup-compatibility/2006" xmlns:aink="http://schemas.microsoft.com/office/drawing/2016/ink" xmlns:am3d="http://schemas.microsoft.com/office/drawing/2017/model3d" xmlns:o="urn:schemas-microsoft-com:office:office" xmlns:oel="http://schemas.microsoft.com/office/2019/extlst" xmlns:r="http://schemas.openxmlformats.org/officeDocument/2006/relationships" xmlns:m="http://schemas.openxmlformats.org/officeDocument/2006/math" xmlns:v="urn:schemas-microsoft-com:vml" xmlns:wp14="http://schemas.microsoft.com/office/word/2010/wordprocessingDrawing" xmlns:wp="http://schemas.openxmlformats.org/drawingml/2006/wordprocessingDrawing" xmlns:w10="urn:schemas-microsoft-com:office:word" xmlns:w="http://schemas.openxmlformats.org/wordprocessingml/2006/main" xmlns:w14="http://schemas.microsoft.com/office/word/2010/wordml" xmlns:w15="http://schemas.microsoft.com/office/word/2012/wordml" xmlns:w16cex="http://schemas.microsoft.com/office/word/2018/wordml/cex" xmlns:w16cid="http://schemas.microsoft.com/office/word/2016/wordml/cid" xmlns:w16="http://schemas.microsoft.com/office/word/2018/wordml" xmlns:w16sdtdh="http://schemas.microsoft.com/office/word/2020/wordml/sdtdatahash" xmlns:w16se="http://schemas.microsoft.com/office/word/2015/wordml/symex" xmlns:wpg="http://schemas.microsoft.com/office/word/2010/wordprocessingGroup" xmlns:wpi="http://schemas.microsoft.com/office/word/2010/wordprocessingInk" xmlns:wne="http://schemas.microsoft.com/office/word/2006/wordml" xmlns:wps="http://schemas.microsoft.com/office/word/2010/wordprocessingShape" mc:Ignorable="w14 w15 w16se w16cid w16 w16cex w16sdtdh wp14">
   <w:endnote w:type="separator" w:id="-1">
     <w:p>
       <w:pPr>
@@ -14151,7 +14233,7 @@
 </file>
 
 <file path=word/footer1.xml><?xml version="1.0" encoding="utf-8"?>
-<w:ftr xmlns:wpc="http://schemas.microsoft.com/office/word/2010/wordprocessingCanvas" xmlns:cx="http://schemas.microsoft.com/office/drawing/2014/chartex" xmlns:cx1="http://schemas.microsoft.com/office/drawing/2015/9/8/chartex" xmlns:cx2="http://schemas.microsoft.com/office/drawing/2015/10/21/chartex" xmlns:cx3="http://schemas.microsoft.com/office/drawing/2016/5/9/chartex" xmlns:cx4="http://schemas.microsoft.com/office/drawing/2016/5/10/chartex" xmlns:cx5="http://schemas.microsoft.com/office/drawing/2016/5/11/chartex" xmlns:cx6="http://schemas.microsoft.com/office/drawing/2016/5/12/chartex" xmlns:cx7="http://schemas.microsoft.com/office/drawing/2016/5/13/chartex" xmlns:cx8="http://schemas.microsoft.com/office/drawing/2016/5/14/chartex" xmlns:mc="http://schemas.openxmlformats.org/markup-compatibility/2006" xmlns:aink="http://schemas.microsoft.com/office/drawing/2016/ink" xmlns:am3d="http://schemas.microsoft.com/office/drawing/2017/model3d" xmlns:o="urn:schemas-microsoft-com:office:office" xmlns:oel="http://schemas.microsoft.com/office/2019/extlst" xmlns:r="http://schemas.openxmlformats.org/officeDocument/2006/relationships" xmlns:m="http://schemas.openxmlformats.org/officeDocument/2006/math" xmlns:v="urn:schemas-microsoft-com:vml" xmlns:wp14="http://schemas.microsoft.com/office/word/2010/wordprocessingDrawing" xmlns:wp="http://schemas.openxmlformats.org/drawingml/2006/wordprocessingDrawing" xmlns:w10="urn:schemas-microsoft-com:office:word" xmlns:w="http://schemas.openxmlformats.org/wordprocessingml/2006/main" xmlns:w14="http://schemas.microsoft.com/office/word/2010/wordml" xmlns:w15="http://schemas.microsoft.com/office/word/2012/wordml" xmlns:w16cex="http://schemas.microsoft.com/office/word/2018/wordml/cex" xmlns:w16cid="http://schemas.microsoft.com/office/word/2016/wordml/cid" xmlns:w16="http://schemas.microsoft.com/office/word/2018/wordml" xmlns:w16du="http://schemas.microsoft.com/office/word/2023/wordml/word16du" xmlns:w16sdtdh="http://schemas.microsoft.com/office/word/2020/wordml/sdtdatahash" xmlns:w16sdtfl="http://schemas.microsoft.com/office/word/2024/wordml/sdtformatlock" xmlns:w16se="http://schemas.microsoft.com/office/word/2015/wordml/symex" xmlns:wpg="http://schemas.microsoft.com/office/word/2010/wordprocessingGroup" xmlns:wpi="http://schemas.microsoft.com/office/word/2010/wordprocessingInk" xmlns:wne="http://schemas.microsoft.com/office/word/2006/wordml" xmlns:wps="http://schemas.microsoft.com/office/word/2010/wordprocessingShape" mc:Ignorable="w14 w15 w16se w16cid w16 w16cex w16sdtdh w16sdtfl w16du wp14">
+<w:ftr xmlns:wpc="http://schemas.microsoft.com/office/word/2010/wordprocessingCanvas" xmlns:cx="http://schemas.microsoft.com/office/drawing/2014/chartex" xmlns:cx1="http://schemas.microsoft.com/office/drawing/2015/9/8/chartex" xmlns:cx2="http://schemas.microsoft.com/office/drawing/2015/10/21/chartex" xmlns:cx3="http://schemas.microsoft.com/office/drawing/2016/5/9/chartex" xmlns:cx4="http://schemas.microsoft.com/office/drawing/2016/5/10/chartex" xmlns:cx5="http://schemas.microsoft.com/office/drawing/2016/5/11/chartex" xmlns:cx6="http://schemas.microsoft.com/office/drawing/2016/5/12/chartex" xmlns:cx7="http://schemas.microsoft.com/office/drawing/2016/5/13/chartex" xmlns:cx8="http://schemas.microsoft.com/office/drawing/2016/5/14/chartex" xmlns:mc="http://schemas.openxmlformats.org/markup-compatibility/2006" xmlns:aink="http://schemas.microsoft.com/office/drawing/2016/ink" xmlns:am3d="http://schemas.microsoft.com/office/drawing/2017/model3d" xmlns:o="urn:schemas-microsoft-com:office:office" xmlns:oel="http://schemas.microsoft.com/office/2019/extlst" xmlns:r="http://schemas.openxmlformats.org/officeDocument/2006/relationships" xmlns:m="http://schemas.openxmlformats.org/officeDocument/2006/math" xmlns:v="urn:schemas-microsoft-com:vml" xmlns:wp14="http://schemas.microsoft.com/office/word/2010/wordprocessingDrawing" xmlns:wp="http://schemas.openxmlformats.org/drawingml/2006/wordprocessingDrawing" xmlns:w10="urn:schemas-microsoft-com:office:word" xmlns:w="http://schemas.openxmlformats.org/wordprocessingml/2006/main" xmlns:w14="http://schemas.microsoft.com/office/word/2010/wordml" xmlns:w15="http://schemas.microsoft.com/office/word/2012/wordml" xmlns:w16cex="http://schemas.microsoft.com/office/word/2018/wordml/cex" xmlns:w16cid="http://schemas.microsoft.com/office/word/2016/wordml/cid" xmlns:w16="http://schemas.microsoft.com/office/word/2018/wordml" xmlns:w16sdtdh="http://schemas.microsoft.com/office/word/2020/wordml/sdtdatahash" xmlns:w16se="http://schemas.microsoft.com/office/word/2015/wordml/symex" xmlns:wpg="http://schemas.microsoft.com/office/word/2010/wordprocessingGroup" xmlns:wpi="http://schemas.microsoft.com/office/word/2010/wordprocessingInk" xmlns:wne="http://schemas.microsoft.com/office/word/2006/wordml" xmlns:wps="http://schemas.microsoft.com/office/word/2010/wordprocessingShape" mc:Ignorable="w14 w15 w16se w16cid w16 w16cex w16sdtdh wp14">
   <w:sdt>
     <w:sdtPr>
       <w:rPr>
@@ -14236,7 +14318,7 @@
 </file>
 
 <file path=word/footer2.xml><?xml version="1.0" encoding="utf-8"?>
-<w:ftr xmlns:wpc="http://schemas.microsoft.com/office/word/2010/wordprocessingCanvas" xmlns:cx="http://schemas.microsoft.com/office/drawing/2014/chartex" xmlns:cx1="http://schemas.microsoft.com/office/drawing/2015/9/8/chartex" xmlns:cx2="http://schemas.microsoft.com/office/drawing/2015/10/21/chartex" xmlns:cx3="http://schemas.microsoft.com/office/drawing/2016/5/9/chartex" xmlns:cx4="http://schemas.microsoft.com/office/drawing/2016/5/10/chartex" xmlns:cx5="http://schemas.microsoft.com/office/drawing/2016/5/11/chartex" xmlns:cx6="http://schemas.microsoft.com/office/drawing/2016/5/12/chartex" xmlns:cx7="http://schemas.microsoft.com/office/drawing/2016/5/13/chartex" xmlns:cx8="http://schemas.microsoft.com/office/drawing/2016/5/14/chartex" xmlns:mc="http://schemas.openxmlformats.org/markup-compatibility/2006" xmlns:aink="http://schemas.microsoft.com/office/drawing/2016/ink" xmlns:am3d="http://schemas.microsoft.com/office/drawing/2017/model3d" xmlns:o="urn:schemas-microsoft-com:office:office" xmlns:oel="http://schemas.microsoft.com/office/2019/extlst" xmlns:r="http://schemas.openxmlformats.org/officeDocument/2006/relationships" xmlns:m="http://schemas.openxmlformats.org/officeDocument/2006/math" xmlns:v="urn:schemas-microsoft-com:vml" xmlns:wp14="http://schemas.microsoft.com/office/word/2010/wordprocessingDrawing" xmlns:wp="http://schemas.openxmlformats.org/drawingml/2006/wordprocessingDrawing" xmlns:w10="urn:schemas-microsoft-com:office:word" xmlns:w="http://schemas.openxmlformats.org/wordprocessingml/2006/main" xmlns:w14="http://schemas.microsoft.com/office/word/2010/wordml" xmlns:w15="http://schemas.microsoft.com/office/word/2012/wordml" xmlns:w16cex="http://schemas.microsoft.com/office/word/2018/wordml/cex" xmlns:w16cid="http://schemas.microsoft.com/office/word/2016/wordml/cid" xmlns:w16="http://schemas.microsoft.com/office/word/2018/wordml" xmlns:w16du="http://schemas.microsoft.com/office/word/2023/wordml/word16du" xmlns:w16sdtdh="http://schemas.microsoft.com/office/word/2020/wordml/sdtdatahash" xmlns:w16sdtfl="http://schemas.microsoft.com/office/word/2024/wordml/sdtformatlock" xmlns:w16se="http://schemas.microsoft.com/office/word/2015/wordml/symex" xmlns:wpg="http://schemas.microsoft.com/office/word/2010/wordprocessingGroup" xmlns:wpi="http://schemas.microsoft.com/office/word/2010/wordprocessingInk" xmlns:wne="http://schemas.microsoft.com/office/word/2006/wordml" xmlns:wps="http://schemas.microsoft.com/office/word/2010/wordprocessingShape" mc:Ignorable="w14 w15 w16se w16cid w16 w16cex w16sdtdh w16sdtfl w16du wp14">
+<w:ftr xmlns:wpc="http://schemas.microsoft.com/office/word/2010/wordprocessingCanvas" xmlns:cx="http://schemas.microsoft.com/office/drawing/2014/chartex" xmlns:cx1="http://schemas.microsoft.com/office/drawing/2015/9/8/chartex" xmlns:cx2="http://schemas.microsoft.com/office/drawing/2015/10/21/chartex" xmlns:cx3="http://schemas.microsoft.com/office/drawing/2016/5/9/chartex" xmlns:cx4="http://schemas.microsoft.com/office/drawing/2016/5/10/chartex" xmlns:cx5="http://schemas.microsoft.com/office/drawing/2016/5/11/chartex" xmlns:cx6="http://schemas.microsoft.com/office/drawing/2016/5/12/chartex" xmlns:cx7="http://schemas.microsoft.com/office/drawing/2016/5/13/chartex" xmlns:cx8="http://schemas.microsoft.com/office/drawing/2016/5/14/chartex" xmlns:mc="http://schemas.openxmlformats.org/markup-compatibility/2006" xmlns:aink="http://schemas.microsoft.com/office/drawing/2016/ink" xmlns:am3d="http://schemas.microsoft.com/office/drawing/2017/model3d" xmlns:o="urn:schemas-microsoft-com:office:office" xmlns:oel="http://schemas.microsoft.com/office/2019/extlst" xmlns:r="http://schemas.openxmlformats.org/officeDocument/2006/relationships" xmlns:m="http://schemas.openxmlformats.org/officeDocument/2006/math" xmlns:v="urn:schemas-microsoft-com:vml" xmlns:wp14="http://schemas.microsoft.com/office/word/2010/wordprocessingDrawing" xmlns:wp="http://schemas.openxmlformats.org/drawingml/2006/wordprocessingDrawing" xmlns:w10="urn:schemas-microsoft-com:office:word" xmlns:w="http://schemas.openxmlformats.org/wordprocessingml/2006/main" xmlns:w14="http://schemas.microsoft.com/office/word/2010/wordml" xmlns:w15="http://schemas.microsoft.com/office/word/2012/wordml" xmlns:w16cex="http://schemas.microsoft.com/office/word/2018/wordml/cex" xmlns:w16cid="http://schemas.microsoft.com/office/word/2016/wordml/cid" xmlns:w16="http://schemas.microsoft.com/office/word/2018/wordml" xmlns:w16sdtdh="http://schemas.microsoft.com/office/word/2020/wordml/sdtdatahash" xmlns:w16se="http://schemas.microsoft.com/office/word/2015/wordml/symex" xmlns:wpg="http://schemas.microsoft.com/office/word/2010/wordprocessingGroup" xmlns:wpi="http://schemas.microsoft.com/office/word/2010/wordprocessingInk" xmlns:wne="http://schemas.microsoft.com/office/word/2006/wordml" xmlns:wps="http://schemas.microsoft.com/office/word/2010/wordprocessingShape" mc:Ignorable="w14 w15 w16se w16cid w16 w16cex w16sdtdh wp14">
   <w:sdt>
     <w:sdtPr>
       <w:rPr>
@@ -14321,7 +14403,7 @@
 </file>
 
 <file path=word/footer3.xml><?xml version="1.0" encoding="utf-8"?>
-<w:ftr xmlns:wpc="http://schemas.microsoft.com/office/word/2010/wordprocessingCanvas" xmlns:cx="http://schemas.microsoft.com/office/drawing/2014/chartex" xmlns:cx1="http://schemas.microsoft.com/office/drawing/2015/9/8/chartex" xmlns:cx2="http://schemas.microsoft.com/office/drawing/2015/10/21/chartex" xmlns:cx3="http://schemas.microsoft.com/office/drawing/2016/5/9/chartex" xmlns:cx4="http://schemas.microsoft.com/office/drawing/2016/5/10/chartex" xmlns:cx5="http://schemas.microsoft.com/office/drawing/2016/5/11/chartex" xmlns:cx6="http://schemas.microsoft.com/office/drawing/2016/5/12/chartex" xmlns:cx7="http://schemas.microsoft.com/office/drawing/2016/5/13/chartex" xmlns:cx8="http://schemas.microsoft.com/office/drawing/2016/5/14/chartex" xmlns:mc="http://schemas.openxmlformats.org/markup-compatibility/2006" xmlns:aink="http://schemas.microsoft.com/office/drawing/2016/ink" xmlns:am3d="http://schemas.microsoft.com/office/drawing/2017/model3d" xmlns:o="urn:schemas-microsoft-com:office:office" xmlns:oel="http://schemas.microsoft.com/office/2019/extlst" xmlns:r="http://schemas.openxmlformats.org/officeDocument/2006/relationships" xmlns:m="http://schemas.openxmlformats.org/officeDocument/2006/math" xmlns:v="urn:schemas-microsoft-com:vml" xmlns:wp14="http://schemas.microsoft.com/office/word/2010/wordprocessingDrawing" xmlns:wp="http://schemas.openxmlformats.org/drawingml/2006/wordprocessingDrawing" xmlns:w10="urn:schemas-microsoft-com:office:word" xmlns:w="http://schemas.openxmlformats.org/wordprocessingml/2006/main" xmlns:w14="http://schemas.microsoft.com/office/word/2010/wordml" xmlns:w15="http://schemas.microsoft.com/office/word/2012/wordml" xmlns:w16cex="http://schemas.microsoft.com/office/word/2018/wordml/cex" xmlns:w16cid="http://schemas.microsoft.com/office/word/2016/wordml/cid" xmlns:w16="http://schemas.microsoft.com/office/word/2018/wordml" xmlns:w16du="http://schemas.microsoft.com/office/word/2023/wordml/word16du" xmlns:w16sdtdh="http://schemas.microsoft.com/office/word/2020/wordml/sdtdatahash" xmlns:w16sdtfl="http://schemas.microsoft.com/office/word/2024/wordml/sdtformatlock" xmlns:w16se="http://schemas.microsoft.com/office/word/2015/wordml/symex" xmlns:wpg="http://schemas.microsoft.com/office/word/2010/wordprocessingGroup" xmlns:wpi="http://schemas.microsoft.com/office/word/2010/wordprocessingInk" xmlns:wne="http://schemas.microsoft.com/office/word/2006/wordml" xmlns:wps="http://schemas.microsoft.com/office/word/2010/wordprocessingShape" mc:Ignorable="w14 w15 w16se w16cid w16 w16cex w16sdtdh w16sdtfl w16du wp14">
+<w:ftr xmlns:wpc="http://schemas.microsoft.com/office/word/2010/wordprocessingCanvas" xmlns:cx="http://schemas.microsoft.com/office/drawing/2014/chartex" xmlns:cx1="http://schemas.microsoft.com/office/drawing/2015/9/8/chartex" xmlns:cx2="http://schemas.microsoft.com/office/drawing/2015/10/21/chartex" xmlns:cx3="http://schemas.microsoft.com/office/drawing/2016/5/9/chartex" xmlns:cx4="http://schemas.microsoft.com/office/drawing/2016/5/10/chartex" xmlns:cx5="http://schemas.microsoft.com/office/drawing/2016/5/11/chartex" xmlns:cx6="http://schemas.microsoft.com/office/drawing/2016/5/12/chartex" xmlns:cx7="http://schemas.microsoft.com/office/drawing/2016/5/13/chartex" xmlns:cx8="http://schemas.microsoft.com/office/drawing/2016/5/14/chartex" xmlns:mc="http://schemas.openxmlformats.org/markup-compatibility/2006" xmlns:aink="http://schemas.microsoft.com/office/drawing/2016/ink" xmlns:am3d="http://schemas.microsoft.com/office/drawing/2017/model3d" xmlns:o="urn:schemas-microsoft-com:office:office" xmlns:oel="http://schemas.microsoft.com/office/2019/extlst" xmlns:r="http://schemas.openxmlformats.org/officeDocument/2006/relationships" xmlns:m="http://schemas.openxmlformats.org/officeDocument/2006/math" xmlns:v="urn:schemas-microsoft-com:vml" xmlns:wp14="http://schemas.microsoft.com/office/word/2010/wordprocessingDrawing" xmlns:wp="http://schemas.openxmlformats.org/drawingml/2006/wordprocessingDrawing" xmlns:w10="urn:schemas-microsoft-com:office:word" xmlns:w="http://schemas.openxmlformats.org/wordprocessingml/2006/main" xmlns:w14="http://schemas.microsoft.com/office/word/2010/wordml" xmlns:w15="http://schemas.microsoft.com/office/word/2012/wordml" xmlns:w16cex="http://schemas.microsoft.com/office/word/2018/wordml/cex" xmlns:w16cid="http://schemas.microsoft.com/office/word/2016/wordml/cid" xmlns:w16="http://schemas.microsoft.com/office/word/2018/wordml" xmlns:w16sdtdh="http://schemas.microsoft.com/office/word/2020/wordml/sdtdatahash" xmlns:w16se="http://schemas.microsoft.com/office/word/2015/wordml/symex" xmlns:wpg="http://schemas.microsoft.com/office/word/2010/wordprocessingGroup" xmlns:wpi="http://schemas.microsoft.com/office/word/2010/wordprocessingInk" xmlns:wne="http://schemas.microsoft.com/office/word/2006/wordml" xmlns:wps="http://schemas.microsoft.com/office/word/2010/wordprocessingShape" mc:Ignorable="w14 w15 w16se w16cid w16 w16cex w16sdtdh wp14">
   <w:p>
     <w:pPr>
       <w:pStyle w:val="Footer"/>
@@ -14337,7 +14419,7 @@
 </file>
 
 <file path=word/footer4.xml><?xml version="1.0" encoding="utf-8"?>
-<w:ftr xmlns:wpc="http://schemas.microsoft.com/office/word/2010/wordprocessingCanvas" xmlns:cx="http://schemas.microsoft.com/office/drawing/2014/chartex" xmlns:cx1="http://schemas.microsoft.com/office/drawing/2015/9/8/chartex" xmlns:cx2="http://schemas.microsoft.com/office/drawing/2015/10/21/chartex" xmlns:cx3="http://schemas.microsoft.com/office/drawing/2016/5/9/chartex" xmlns:cx4="http://schemas.microsoft.com/office/drawing/2016/5/10/chartex" xmlns:cx5="http://schemas.microsoft.com/office/drawing/2016/5/11/chartex" xmlns:cx6="http://schemas.microsoft.com/office/drawing/2016/5/12/chartex" xmlns:cx7="http://schemas.microsoft.com/office/drawing/2016/5/13/chartex" xmlns:cx8="http://schemas.microsoft.com/office/drawing/2016/5/14/chartex" xmlns:mc="http://schemas.openxmlformats.org/markup-compatibility/2006" xmlns:aink="http://schemas.microsoft.com/office/drawing/2016/ink" xmlns:am3d="http://schemas.microsoft.com/office/drawing/2017/model3d" xmlns:o="urn:schemas-microsoft-com:office:office" xmlns:oel="http://schemas.microsoft.com/office/2019/extlst" xmlns:r="http://schemas.openxmlformats.org/officeDocument/2006/relationships" xmlns:m="http://schemas.openxmlformats.org/officeDocument/2006/math" xmlns:v="urn:schemas-microsoft-com:vml" xmlns:wp14="http://schemas.microsoft.com/office/word/2010/wordprocessingDrawing" xmlns:wp="http://schemas.openxmlformats.org/drawingml/2006/wordprocessingDrawing" xmlns:w10="urn:schemas-microsoft-com:office:word" xmlns:w="http://schemas.openxmlformats.org/wordprocessingml/2006/main" xmlns:w14="http://schemas.microsoft.com/office/word/2010/wordml" xmlns:w15="http://schemas.microsoft.com/office/word/2012/wordml" xmlns:w16cex="http://schemas.microsoft.com/office/word/2018/wordml/cex" xmlns:w16cid="http://schemas.microsoft.com/office/word/2016/wordml/cid" xmlns:w16="http://schemas.microsoft.com/office/word/2018/wordml" xmlns:w16du="http://schemas.microsoft.com/office/word/2023/wordml/word16du" xmlns:w16sdtdh="http://schemas.microsoft.com/office/word/2020/wordml/sdtdatahash" xmlns:w16sdtfl="http://schemas.microsoft.com/office/word/2024/wordml/sdtformatlock" xmlns:w16se="http://schemas.microsoft.com/office/word/2015/wordml/symex" xmlns:wpg="http://schemas.microsoft.com/office/word/2010/wordprocessingGroup" xmlns:wpi="http://schemas.microsoft.com/office/word/2010/wordprocessingInk" xmlns:wne="http://schemas.microsoft.com/office/word/2006/wordml" xmlns:wps="http://schemas.microsoft.com/office/word/2010/wordprocessingShape" mc:Ignorable="w14 w15 w16se w16cid w16 w16cex w16sdtdh w16sdtfl w16du wp14">
+<w:ftr xmlns:wpc="http://schemas.microsoft.com/office/word/2010/wordprocessingCanvas" xmlns:cx="http://schemas.microsoft.com/office/drawing/2014/chartex" xmlns:cx1="http://schemas.microsoft.com/office/drawing/2015/9/8/chartex" xmlns:cx2="http://schemas.microsoft.com/office/drawing/2015/10/21/chartex" xmlns:cx3="http://schemas.microsoft.com/office/drawing/2016/5/9/chartex" xmlns:cx4="http://schemas.microsoft.com/office/drawing/2016/5/10/chartex" xmlns:cx5="http://schemas.microsoft.com/office/drawing/2016/5/11/chartex" xmlns:cx6="http://schemas.microsoft.com/office/drawing/2016/5/12/chartex" xmlns:cx7="http://schemas.microsoft.com/office/drawing/2016/5/13/chartex" xmlns:cx8="http://schemas.microsoft.com/office/drawing/2016/5/14/chartex" xmlns:mc="http://schemas.openxmlformats.org/markup-compatibility/2006" xmlns:aink="http://schemas.microsoft.com/office/drawing/2016/ink" xmlns:am3d="http://schemas.microsoft.com/office/drawing/2017/model3d" xmlns:o="urn:schemas-microsoft-com:office:office" xmlns:oel="http://schemas.microsoft.com/office/2019/extlst" xmlns:r="http://schemas.openxmlformats.org/officeDocument/2006/relationships" xmlns:m="http://schemas.openxmlformats.org/officeDocument/2006/math" xmlns:v="urn:schemas-microsoft-com:vml" xmlns:wp14="http://schemas.microsoft.com/office/word/2010/wordprocessingDrawing" xmlns:wp="http://schemas.openxmlformats.org/drawingml/2006/wordprocessingDrawing" xmlns:w10="urn:schemas-microsoft-com:office:word" xmlns:w="http://schemas.openxmlformats.org/wordprocessingml/2006/main" xmlns:w14="http://schemas.microsoft.com/office/word/2010/wordml" xmlns:w15="http://schemas.microsoft.com/office/word/2012/wordml" xmlns:w16cex="http://schemas.microsoft.com/office/word/2018/wordml/cex" xmlns:w16cid="http://schemas.microsoft.com/office/word/2016/wordml/cid" xmlns:w16="http://schemas.microsoft.com/office/word/2018/wordml" xmlns:w16sdtdh="http://schemas.microsoft.com/office/word/2020/wordml/sdtdatahash" xmlns:w16se="http://schemas.microsoft.com/office/word/2015/wordml/symex" xmlns:wpg="http://schemas.microsoft.com/office/word/2010/wordprocessingGroup" xmlns:wpi="http://schemas.microsoft.com/office/word/2010/wordprocessingInk" xmlns:wne="http://schemas.microsoft.com/office/word/2006/wordml" xmlns:wps="http://schemas.microsoft.com/office/word/2010/wordprocessingShape" mc:Ignorable="w14 w15 w16se w16cid w16 w16cex w16sdtdh wp14">
   <w:sdt>
     <w:sdtPr>
       <w:id w:val="665674313"/>
@@ -14390,7 +14472,7 @@
 </file>
 
 <file path=word/footer5.xml><?xml version="1.0" encoding="utf-8"?>
-<w:ftr xmlns:wpc="http://schemas.microsoft.com/office/word/2010/wordprocessingCanvas" xmlns:cx="http://schemas.microsoft.com/office/drawing/2014/chartex" xmlns:cx1="http://schemas.microsoft.com/office/drawing/2015/9/8/chartex" xmlns:cx2="http://schemas.microsoft.com/office/drawing/2015/10/21/chartex" xmlns:cx3="http://schemas.microsoft.com/office/drawing/2016/5/9/chartex" xmlns:cx4="http://schemas.microsoft.com/office/drawing/2016/5/10/chartex" xmlns:cx5="http://schemas.microsoft.com/office/drawing/2016/5/11/chartex" xmlns:cx6="http://schemas.microsoft.com/office/drawing/2016/5/12/chartex" xmlns:cx7="http://schemas.microsoft.com/office/drawing/2016/5/13/chartex" xmlns:cx8="http://schemas.microsoft.com/office/drawing/2016/5/14/chartex" xmlns:mc="http://schemas.openxmlformats.org/markup-compatibility/2006" xmlns:aink="http://schemas.microsoft.com/office/drawing/2016/ink" xmlns:am3d="http://schemas.microsoft.com/office/drawing/2017/model3d" xmlns:o="urn:schemas-microsoft-com:office:office" xmlns:oel="http://schemas.microsoft.com/office/2019/extlst" xmlns:r="http://schemas.openxmlformats.org/officeDocument/2006/relationships" xmlns:m="http://schemas.openxmlformats.org/officeDocument/2006/math" xmlns:v="urn:schemas-microsoft-com:vml" xmlns:wp14="http://schemas.microsoft.com/office/word/2010/wordprocessingDrawing" xmlns:wp="http://schemas.openxmlformats.org/drawingml/2006/wordprocessingDrawing" xmlns:w10="urn:schemas-microsoft-com:office:word" xmlns:w="http://schemas.openxmlformats.org/wordprocessingml/2006/main" xmlns:w14="http://schemas.microsoft.com/office/word/2010/wordml" xmlns:w15="http://schemas.microsoft.com/office/word/2012/wordml" xmlns:w16cex="http://schemas.microsoft.com/office/word/2018/wordml/cex" xmlns:w16cid="http://schemas.microsoft.com/office/word/2016/wordml/cid" xmlns:w16="http://schemas.microsoft.com/office/word/2018/wordml" xmlns:w16du="http://schemas.microsoft.com/office/word/2023/wordml/word16du" xmlns:w16sdtdh="http://schemas.microsoft.com/office/word/2020/wordml/sdtdatahash" xmlns:w16sdtfl="http://schemas.microsoft.com/office/word/2024/wordml/sdtformatlock" xmlns:w16se="http://schemas.microsoft.com/office/word/2015/wordml/symex" xmlns:wpg="http://schemas.microsoft.com/office/word/2010/wordprocessingGroup" xmlns:wpi="http://schemas.microsoft.com/office/word/2010/wordprocessingInk" xmlns:wne="http://schemas.microsoft.com/office/word/2006/wordml" xmlns:wps="http://schemas.microsoft.com/office/word/2010/wordprocessingShape" mc:Ignorable="w14 w15 w16se w16cid w16 w16cex w16sdtdh w16sdtfl w16du wp14">
+<w:ftr xmlns:wpc="http://schemas.microsoft.com/office/word/2010/wordprocessingCanvas" xmlns:cx="http://schemas.microsoft.com/office/drawing/2014/chartex" xmlns:cx1="http://schemas.microsoft.com/office/drawing/2015/9/8/chartex" xmlns:cx2="http://schemas.microsoft.com/office/drawing/2015/10/21/chartex" xmlns:cx3="http://schemas.microsoft.com/office/drawing/2016/5/9/chartex" xmlns:cx4="http://schemas.microsoft.com/office/drawing/2016/5/10/chartex" xmlns:cx5="http://schemas.microsoft.com/office/drawing/2016/5/11/chartex" xmlns:cx6="http://schemas.microsoft.com/office/drawing/2016/5/12/chartex" xmlns:cx7="http://schemas.microsoft.com/office/drawing/2016/5/13/chartex" xmlns:cx8="http://schemas.microsoft.com/office/drawing/2016/5/14/chartex" xmlns:mc="http://schemas.openxmlformats.org/markup-compatibility/2006" xmlns:aink="http://schemas.microsoft.com/office/drawing/2016/ink" xmlns:am3d="http://schemas.microsoft.com/office/drawing/2017/model3d" xmlns:o="urn:schemas-microsoft-com:office:office" xmlns:oel="http://schemas.microsoft.com/office/2019/extlst" xmlns:r="http://schemas.openxmlformats.org/officeDocument/2006/relationships" xmlns:m="http://schemas.openxmlformats.org/officeDocument/2006/math" xmlns:v="urn:schemas-microsoft-com:vml" xmlns:wp14="http://schemas.microsoft.com/office/word/2010/wordprocessingDrawing" xmlns:wp="http://schemas.openxmlformats.org/drawingml/2006/wordprocessingDrawing" xmlns:w10="urn:schemas-microsoft-com:office:word" xmlns:w="http://schemas.openxmlformats.org/wordprocessingml/2006/main" xmlns:w14="http://schemas.microsoft.com/office/word/2010/wordml" xmlns:w15="http://schemas.microsoft.com/office/word/2012/wordml" xmlns:w16cex="http://schemas.microsoft.com/office/word/2018/wordml/cex" xmlns:w16cid="http://schemas.microsoft.com/office/word/2016/wordml/cid" xmlns:w16="http://schemas.microsoft.com/office/word/2018/wordml" xmlns:w16sdtdh="http://schemas.microsoft.com/office/word/2020/wordml/sdtdatahash" xmlns:w16se="http://schemas.microsoft.com/office/word/2015/wordml/symex" xmlns:wpg="http://schemas.microsoft.com/office/word/2010/wordprocessingGroup" xmlns:wpi="http://schemas.microsoft.com/office/word/2010/wordprocessingInk" xmlns:wne="http://schemas.microsoft.com/office/word/2006/wordml" xmlns:wps="http://schemas.microsoft.com/office/word/2010/wordprocessingShape" mc:Ignorable="w14 w15 w16se w16cid w16 w16cex w16sdtdh wp14">
   <w:sdt>
     <w:sdtPr>
       <w:id w:val="1739596823"/>
@@ -14443,7 +14525,7 @@
 </file>
 
 <file path=word/footnotes.xml><?xml version="1.0" encoding="utf-8"?>
-<w:footnotes xmlns:wpc="http://schemas.microsoft.com/office/word/2010/wordprocessingCanvas" xmlns:cx="http://schemas.microsoft.com/office/drawing/2014/chartex" xmlns:cx1="http://schemas.microsoft.com/office/drawing/2015/9/8/chartex" xmlns:cx2="http://schemas.microsoft.com/office/drawing/2015/10/21/chartex" xmlns:cx3="http://schemas.microsoft.com/office/drawing/2016/5/9/chartex" xmlns:cx4="http://schemas.microsoft.com/office/drawing/2016/5/10/chartex" xmlns:cx5="http://schemas.microsoft.com/office/drawing/2016/5/11/chartex" xmlns:cx6="http://schemas.microsoft.com/office/drawing/2016/5/12/chartex" xmlns:cx7="http://schemas.microsoft.com/office/drawing/2016/5/13/chartex" xmlns:cx8="http://schemas.microsoft.com/office/drawing/2016/5/14/chartex" xmlns:mc="http://schemas.openxmlformats.org/markup-compatibility/2006" xmlns:aink="http://schemas.microsoft.com/office/drawing/2016/ink" xmlns:am3d="http://schemas.microsoft.com/office/drawing/2017/model3d" xmlns:o="urn:schemas-microsoft-com:office:office" xmlns:oel="http://schemas.microsoft.com/office/2019/extlst" xmlns:r="http://schemas.openxmlformats.org/officeDocument/2006/relationships" xmlns:m="http://schemas.openxmlformats.org/officeDocument/2006/math" xmlns:v="urn:schemas-microsoft-com:vml" xmlns:wp14="http://schemas.microsoft.com/office/word/2010/wordprocessingDrawing" xmlns:wp="http://schemas.openxmlformats.org/drawingml/2006/wordprocessingDrawing" xmlns:w10="urn:schemas-microsoft-com:office:word" xmlns:w="http://schemas.openxmlformats.org/wordprocessingml/2006/main" xmlns:w14="http://schemas.microsoft.com/office/word/2010/wordml" xmlns:w15="http://schemas.microsoft.com/office/word/2012/wordml" xmlns:w16cex="http://schemas.microsoft.com/office/word/2018/wordml/cex" xmlns:w16cid="http://schemas.microsoft.com/office/word/2016/wordml/cid" xmlns:w16="http://schemas.microsoft.com/office/word/2018/wordml" xmlns:w16du="http://schemas.microsoft.com/office/word/2023/wordml/word16du" xmlns:w16sdtdh="http://schemas.microsoft.com/office/word/2020/wordml/sdtdatahash" xmlns:w16sdtfl="http://schemas.microsoft.com/office/word/2024/wordml/sdtformatlock" xmlns:w16se="http://schemas.microsoft.com/office/word/2015/wordml/symex" xmlns:wpg="http://schemas.microsoft.com/office/word/2010/wordprocessingGroup" xmlns:wpi="http://schemas.microsoft.com/office/word/2010/wordprocessingInk" xmlns:wne="http://schemas.microsoft.com/office/word/2006/wordml" xmlns:wps="http://schemas.microsoft.com/office/word/2010/wordprocessingShape" mc:Ignorable="w14 w15 w16se w16cid w16 w16cex w16sdtdh w16sdtfl w16du wp14">
+<w:footnotes xmlns:wpc="http://schemas.microsoft.com/office/word/2010/wordprocessingCanvas" xmlns:cx="http://schemas.microsoft.com/office/drawing/2014/chartex" xmlns:cx1="http://schemas.microsoft.com/office/drawing/2015/9/8/chartex" xmlns:cx2="http://schemas.microsoft.com/office/drawing/2015/10/21/chartex" xmlns:cx3="http://schemas.microsoft.com/office/drawing/2016/5/9/chartex" xmlns:cx4="http://schemas.microsoft.com/office/drawing/2016/5/10/chartex" xmlns:cx5="http://schemas.microsoft.com/office/drawing/2016/5/11/chartex" xmlns:cx6="http://schemas.microsoft.com/office/drawing/2016/5/12/chartex" xmlns:cx7="http://schemas.microsoft.com/office/drawing/2016/5/13/chartex" xmlns:cx8="http://schemas.microsoft.com/office/drawing/2016/5/14/chartex" xmlns:mc="http://schemas.openxmlformats.org/markup-compatibility/2006" xmlns:aink="http://schemas.microsoft.com/office/drawing/2016/ink" xmlns:am3d="http://schemas.microsoft.com/office/drawing/2017/model3d" xmlns:o="urn:schemas-microsoft-com:office:office" xmlns:oel="http://schemas.microsoft.com/office/2019/extlst" xmlns:r="http://schemas.openxmlformats.org/officeDocument/2006/relationships" xmlns:m="http://schemas.openxmlformats.org/officeDocument/2006/math" xmlns:v="urn:schemas-microsoft-com:vml" xmlns:wp14="http://schemas.microsoft.com/office/word/2010/wordprocessingDrawing" xmlns:wp="http://schemas.openxmlformats.org/drawingml/2006/wordprocessingDrawing" xmlns:w10="urn:schemas-microsoft-com:office:word" xmlns:w="http://schemas.openxmlformats.org/wordprocessingml/2006/main" xmlns:w14="http://schemas.microsoft.com/office/word/2010/wordml" xmlns:w15="http://schemas.microsoft.com/office/word/2012/wordml" xmlns:w16cex="http://schemas.microsoft.com/office/word/2018/wordml/cex" xmlns:w16cid="http://schemas.microsoft.com/office/word/2016/wordml/cid" xmlns:w16="http://schemas.microsoft.com/office/word/2018/wordml" xmlns:w16sdtdh="http://schemas.microsoft.com/office/word/2020/wordml/sdtdatahash" xmlns:w16se="http://schemas.microsoft.com/office/word/2015/wordml/symex" xmlns:wpg="http://schemas.microsoft.com/office/word/2010/wordprocessingGroup" xmlns:wpi="http://schemas.microsoft.com/office/word/2010/wordprocessingInk" xmlns:wne="http://schemas.microsoft.com/office/word/2006/wordml" xmlns:wps="http://schemas.microsoft.com/office/word/2010/wordprocessingShape" mc:Ignorable="w14 w15 w16se w16cid w16 w16cex w16sdtdh wp14">
   <w:footnote w:type="separator" w:id="-1">
     <w:p>
       <w:pPr>
@@ -14468,7 +14550,7 @@
 </file>
 
 <file path=word/header1.xml><?xml version="1.0" encoding="utf-8"?>
-<w:hdr xmlns:wpc="http://schemas.microsoft.com/office/word/2010/wordprocessingCanvas" xmlns:cx="http://schemas.microsoft.com/office/drawing/2014/chartex" xmlns:cx1="http://schemas.microsoft.com/office/drawing/2015/9/8/chartex" xmlns:cx2="http://schemas.microsoft.com/office/drawing/2015/10/21/chartex" xmlns:cx3="http://schemas.microsoft.com/office/drawing/2016/5/9/chartex" xmlns:cx4="http://schemas.microsoft.com/office/drawing/2016/5/10/chartex" xmlns:cx5="http://schemas.microsoft.com/office/drawing/2016/5/11/chartex" xmlns:cx6="http://schemas.microsoft.com/office/drawing/2016/5/12/chartex" xmlns:cx7="http://schemas.microsoft.com/office/drawing/2016/5/13/chartex" xmlns:cx8="http://schemas.microsoft.com/office/drawing/2016/5/14/chartex" xmlns:mc="http://schemas.openxmlformats.org/markup-compatibility/2006" xmlns:aink="http://schemas.microsoft.com/office/drawing/2016/ink" xmlns:am3d="http://schemas.microsoft.com/office/drawing/2017/model3d" xmlns:o="urn:schemas-microsoft-com:office:office" xmlns:oel="http://schemas.microsoft.com/office/2019/extlst" xmlns:r="http://schemas.openxmlformats.org/officeDocument/2006/relationships" xmlns:m="http://schemas.openxmlformats.org/officeDocument/2006/math" xmlns:v="urn:schemas-microsoft-com:vml" xmlns:wp14="http://schemas.microsoft.com/office/word/2010/wordprocessingDrawing" xmlns:wp="http://schemas.openxmlformats.org/drawingml/2006/wordprocessingDrawing" xmlns:w10="urn:schemas-microsoft-com:office:word" xmlns:w="http://schemas.openxmlformats.org/wordprocessingml/2006/main" xmlns:w14="http://schemas.microsoft.com/office/word/2010/wordml" xmlns:w15="http://schemas.microsoft.com/office/word/2012/wordml" xmlns:w16cex="http://schemas.microsoft.com/office/word/2018/wordml/cex" xmlns:w16cid="http://schemas.microsoft.com/office/word/2016/wordml/cid" xmlns:w16="http://schemas.microsoft.com/office/word/2018/wordml" xmlns:w16du="http://schemas.microsoft.com/office/word/2023/wordml/word16du" xmlns:w16sdtdh="http://schemas.microsoft.com/office/word/2020/wordml/sdtdatahash" xmlns:w16sdtfl="http://schemas.microsoft.com/office/word/2024/wordml/sdtformatlock" xmlns:w16se="http://schemas.microsoft.com/office/word/2015/wordml/symex" xmlns:wpg="http://schemas.microsoft.com/office/word/2010/wordprocessingGroup" xmlns:wpi="http://schemas.microsoft.com/office/word/2010/wordprocessingInk" xmlns:wne="http://schemas.microsoft.com/office/word/2006/wordml" xmlns:wps="http://schemas.microsoft.com/office/word/2010/wordprocessingShape" mc:Ignorable="w14 w15 w16se w16cid w16 w16cex w16sdtdh w16sdtfl w16du wp14">
+<w:hdr xmlns:wpc="http://schemas.microsoft.com/office/word/2010/wordprocessingCanvas" xmlns:cx="http://schemas.microsoft.com/office/drawing/2014/chartex" xmlns:cx1="http://schemas.microsoft.com/office/drawing/2015/9/8/chartex" xmlns:cx2="http://schemas.microsoft.com/office/drawing/2015/10/21/chartex" xmlns:cx3="http://schemas.microsoft.com/office/drawing/2016/5/9/chartex" xmlns:cx4="http://schemas.microsoft.com/office/drawing/2016/5/10/chartex" xmlns:cx5="http://schemas.microsoft.com/office/drawing/2016/5/11/chartex" xmlns:cx6="http://schemas.microsoft.com/office/drawing/2016/5/12/chartex" xmlns:cx7="http://schemas.microsoft.com/office/drawing/2016/5/13/chartex" xmlns:cx8="http://schemas.microsoft.com/office/drawing/2016/5/14/chartex" xmlns:mc="http://schemas.openxmlformats.org/markup-compatibility/2006" xmlns:aink="http://schemas.microsoft.com/office/drawing/2016/ink" xmlns:am3d="http://schemas.microsoft.com/office/drawing/2017/model3d" xmlns:o="urn:schemas-microsoft-com:office:office" xmlns:oel="http://schemas.microsoft.com/office/2019/extlst" xmlns:r="http://schemas.openxmlformats.org/officeDocument/2006/relationships" xmlns:m="http://schemas.openxmlformats.org/officeDocument/2006/math" xmlns:v="urn:schemas-microsoft-com:vml" xmlns:wp14="http://schemas.microsoft.com/office/word/2010/wordprocessingDrawing" xmlns:wp="http://schemas.openxmlformats.org/drawingml/2006/wordprocessingDrawing" xmlns:w10="urn:schemas-microsoft-com:office:word" xmlns:w="http://schemas.openxmlformats.org/wordprocessingml/2006/main" xmlns:w14="http://schemas.microsoft.com/office/word/2010/wordml" xmlns:w15="http://schemas.microsoft.com/office/word/2012/wordml" xmlns:w16cex="http://schemas.microsoft.com/office/word/2018/wordml/cex" xmlns:w16cid="http://schemas.microsoft.com/office/word/2016/wordml/cid" xmlns:w16="http://schemas.microsoft.com/office/word/2018/wordml" xmlns:w16sdtdh="http://schemas.microsoft.com/office/word/2020/wordml/sdtdatahash" xmlns:w16se="http://schemas.microsoft.com/office/word/2015/wordml/symex" xmlns:wpg="http://schemas.microsoft.com/office/word/2010/wordprocessingGroup" xmlns:wpi="http://schemas.microsoft.com/office/word/2010/wordprocessingInk" xmlns:wne="http://schemas.microsoft.com/office/word/2006/wordml" xmlns:wps="http://schemas.microsoft.com/office/word/2010/wordprocessingShape" mc:Ignorable="w14 w15 w16se w16cid w16 w16cex w16sdtdh wp14">
   <w:p>
     <w:pPr>
       <w:pStyle w:val="Header"/>
@@ -14498,7 +14580,7 @@
 </file>
 
 <file path=word/numbering.xml><?xml version="1.0" encoding="utf-8"?>
-<w:numbering xmlns:wpc="http://schemas.microsoft.com/office/word/2010/wordprocessingCanvas" xmlns:cx="http://schemas.microsoft.com/office/drawing/2014/chartex" xmlns:cx1="http://schemas.microsoft.com/office/drawing/2015/9/8/chartex" xmlns:cx2="http://schemas.microsoft.com/office/drawing/2015/10/21/chartex" xmlns:cx3="http://schemas.microsoft.com/office/drawing/2016/5/9/chartex" xmlns:cx4="http://schemas.microsoft.com/office/drawing/2016/5/10/chartex" xmlns:cx5="http://schemas.microsoft.com/office/drawing/2016/5/11/chartex" xmlns:cx6="http://schemas.microsoft.com/office/drawing/2016/5/12/chartex" xmlns:cx7="http://schemas.microsoft.com/office/drawing/2016/5/13/chartex" xmlns:cx8="http://schemas.microsoft.com/office/drawing/2016/5/14/chartex" xmlns:mc="http://schemas.openxmlformats.org/markup-compatibility/2006" xmlns:aink="http://schemas.microsoft.com/office/drawing/2016/ink" xmlns:am3d="http://schemas.microsoft.com/office/drawing/2017/model3d" xmlns:o="urn:schemas-microsoft-com:office:office" xmlns:oel="http://schemas.microsoft.com/office/2019/extlst" xmlns:r="http://schemas.openxmlformats.org/officeDocument/2006/relationships" xmlns:m="http://schemas.openxmlformats.org/officeDocument/2006/math" xmlns:v="urn:schemas-microsoft-com:vml" xmlns:wp14="http://schemas.microsoft.com/office/word/2010/wordprocessingDrawing" xmlns:wp="http://schemas.openxmlformats.org/drawingml/2006/wordprocessingDrawing" xmlns:w10="urn:schemas-microsoft-com:office:word" xmlns:w="http://schemas.openxmlformats.org/wordprocessingml/2006/main" xmlns:w14="http://schemas.microsoft.com/office/word/2010/wordml" xmlns:w15="http://schemas.microsoft.com/office/word/2012/wordml" xmlns:w16cex="http://schemas.microsoft.com/office/word/2018/wordml/cex" xmlns:w16cid="http://schemas.microsoft.com/office/word/2016/wordml/cid" xmlns:w16="http://schemas.microsoft.com/office/word/2018/wordml" xmlns:w16du="http://schemas.microsoft.com/office/word/2023/wordml/word16du" xmlns:w16sdtdh="http://schemas.microsoft.com/office/word/2020/wordml/sdtdatahash" xmlns:w16sdtfl="http://schemas.microsoft.com/office/word/2024/wordml/sdtformatlock" xmlns:w16se="http://schemas.microsoft.com/office/word/2015/wordml/symex" xmlns:wpg="http://schemas.microsoft.com/office/word/2010/wordprocessingGroup" xmlns:wpi="http://schemas.microsoft.com/office/word/2010/wordprocessingInk" xmlns:wne="http://schemas.microsoft.com/office/word/2006/wordml" xmlns:wps="http://schemas.microsoft.com/office/word/2010/wordprocessingShape" mc:Ignorable="w14 w15 w16se w16cid w16 w16cex w16sdtdh w16sdtfl w16du wp14">
+<w:numbering xmlns:wpc="http://schemas.microsoft.com/office/word/2010/wordprocessingCanvas" xmlns:cx="http://schemas.microsoft.com/office/drawing/2014/chartex" xmlns:cx1="http://schemas.microsoft.com/office/drawing/2015/9/8/chartex" xmlns:cx2="http://schemas.microsoft.com/office/drawing/2015/10/21/chartex" xmlns:cx3="http://schemas.microsoft.com/office/drawing/2016/5/9/chartex" xmlns:cx4="http://schemas.microsoft.com/office/drawing/2016/5/10/chartex" xmlns:cx5="http://schemas.microsoft.com/office/drawing/2016/5/11/chartex" xmlns:cx6="http://schemas.microsoft.com/office/drawing/2016/5/12/chartex" xmlns:cx7="http://schemas.microsoft.com/office/drawing/2016/5/13/chartex" xmlns:cx8="http://schemas.microsoft.com/office/drawing/2016/5/14/chartex" xmlns:mc="http://schemas.openxmlformats.org/markup-compatibility/2006" xmlns:aink="http://schemas.microsoft.com/office/drawing/2016/ink" xmlns:am3d="http://schemas.microsoft.com/office/drawing/2017/model3d" xmlns:o="urn:schemas-microsoft-com:office:office" xmlns:oel="http://schemas.microsoft.com/office/2019/extlst" xmlns:r="http://schemas.openxmlformats.org/officeDocument/2006/relationships" xmlns:m="http://schemas.openxmlformats.org/officeDocument/2006/math" xmlns:v="urn:schemas-microsoft-com:vml" xmlns:wp14="http://schemas.microsoft.com/office/word/2010/wordprocessingDrawing" xmlns:wp="http://schemas.openxmlformats.org/drawingml/2006/wordprocessingDrawing" xmlns:w10="urn:schemas-microsoft-com:office:word" xmlns:w="http://schemas.openxmlformats.org/wordprocessingml/2006/main" xmlns:w14="http://schemas.microsoft.com/office/word/2010/wordml" xmlns:w15="http://schemas.microsoft.com/office/word/2012/wordml" xmlns:w16cex="http://schemas.microsoft.com/office/word/2018/wordml/cex" xmlns:w16cid="http://schemas.microsoft.com/office/word/2016/wordml/cid" xmlns:w16="http://schemas.microsoft.com/office/word/2018/wordml" xmlns:w16sdtdh="http://schemas.microsoft.com/office/word/2020/wordml/sdtdatahash" xmlns:w16se="http://schemas.microsoft.com/office/word/2015/wordml/symex" xmlns:wpg="http://schemas.microsoft.com/office/word/2010/wordprocessingGroup" xmlns:wpi="http://schemas.microsoft.com/office/word/2010/wordprocessingInk" xmlns:wne="http://schemas.microsoft.com/office/word/2006/wordml" xmlns:wps="http://schemas.microsoft.com/office/word/2010/wordprocessingShape" mc:Ignorable="w14 w15 w16se w16cid w16 w16cex w16sdtdh wp14">
   <w:abstractNum w:abstractNumId="0" w15:restartNumberingAfterBreak="0">
     <w:nsid w:val="0D1A55F3"/>
     <w:multiLevelType w:val="hybridMultilevel"/>
@@ -17520,7 +17602,7 @@
 </file>
 
 <file path=word/styles.xml><?xml version="1.0" encoding="utf-8"?>
-<w:styles xmlns:mc="http://schemas.openxmlformats.org/markup-compatibility/2006" xmlns:r="http://schemas.openxmlformats.org/officeDocument/2006/relationships" xmlns:w="http://schemas.openxmlformats.org/wordprocessingml/2006/main" xmlns:w14="http://schemas.microsoft.com/office/word/2010/wordml" xmlns:w15="http://schemas.microsoft.com/office/word/2012/wordml" xmlns:w16cex="http://schemas.microsoft.com/office/word/2018/wordml/cex" xmlns:w16cid="http://schemas.microsoft.com/office/word/2016/wordml/cid" xmlns:w16="http://schemas.microsoft.com/office/word/2018/wordml" xmlns:w16du="http://schemas.microsoft.com/office/word/2023/wordml/word16du" xmlns:w16sdtdh="http://schemas.microsoft.com/office/word/2020/wordml/sdtdatahash" xmlns:w16sdtfl="http://schemas.microsoft.com/office/word/2024/wordml/sdtformatlock" xmlns:w16se="http://schemas.microsoft.com/office/word/2015/wordml/symex" mc:Ignorable="w14 w15 w16se w16cid w16 w16cex w16sdtdh w16sdtfl w16du">
+<w:styles xmlns:mc="http://schemas.openxmlformats.org/markup-compatibility/2006" xmlns:r="http://schemas.openxmlformats.org/officeDocument/2006/relationships" xmlns:w="http://schemas.openxmlformats.org/wordprocessingml/2006/main" xmlns:w14="http://schemas.microsoft.com/office/word/2010/wordml" xmlns:w15="http://schemas.microsoft.com/office/word/2012/wordml" xmlns:w16cex="http://schemas.microsoft.com/office/word/2018/wordml/cex" xmlns:w16cid="http://schemas.microsoft.com/office/word/2016/wordml/cid" xmlns:w16="http://schemas.microsoft.com/office/word/2018/wordml" xmlns:w16sdtdh="http://schemas.microsoft.com/office/word/2020/wordml/sdtdatahash" xmlns:w16se="http://schemas.microsoft.com/office/word/2015/wordml/symex" mc:Ignorable="w14 w15 w16se w16cid w16 w16cex w16sdtdh">
   <w:docDefaults>
     <w:rPrDefault>
       <w:rPr>
@@ -17919,7 +18001,7 @@
   <w:style w:type="paragraph" w:default="1" w:styleId="Normal">
     <w:name w:val="Normal"/>
     <w:qFormat/>
-    <w:rsid w:val="00FE3C1D"/>
+    <w:rsid w:val="00BF2EFE"/>
     <w:rPr>
       <w:rFonts w:ascii="Times New Roman" w:hAnsi="Times New Roman"/>
       <w:sz w:val="24"/>
@@ -18127,6 +18209,7 @@
   <w:style w:type="character" w:default="1" w:styleId="DefaultParagraphFont">
     <w:name w:val="Default Paragraph Font"/>
     <w:uiPriority w:val="1"/>
+    <w:semiHidden/>
     <w:unhideWhenUsed/>
   </w:style>
   <w:style w:type="table" w:default="1" w:styleId="TableNormal">

</xml_diff>

<commit_message>
Completed milestones ,gantt chart and reviewed the document
</commit_message>
<xml_diff>
--- a/Report/zerowaste_business_plan.docx
+++ b/Report/zerowaste_business_plan.docx
@@ -5787,17 +5787,10 @@
           <w:ilvl w:val="0"/>
           <w:numId w:val="0"/>
         </w:numPr>
-        <w:ind w:left="360" w:hanging="360"/>
-        <w:jc w:val="center"/>
-        <w:rPr>
-          <w:rFonts w:cs="Times New Roman"/>
-        </w:rPr>
+        <w:ind w:left="360"/>
       </w:pPr>
       <w:bookmarkStart w:id="0" w:name="_Toc232106210"/>
       <w:r>
-        <w:rPr>
-          <w:rFonts w:cs="Times New Roman"/>
-        </w:rPr>
         <w:lastRenderedPageBreak/>
         <w:t>Abstract</w:t>
       </w:r>
@@ -5874,7 +5867,6 @@
         <w:jc w:val="center"/>
         <w:rPr>
           <w:rStyle w:val="Main-HeadingChar"/>
-          <w:rFonts w:cs="Times New Roman"/>
         </w:rPr>
       </w:pPr>
       <w:r>
@@ -5888,7 +5880,6 @@
       <w:r>
         <w:rPr>
           <w:rStyle w:val="Main-HeadingChar"/>
-          <w:rFonts w:cs="Times New Roman"/>
         </w:rPr>
         <w:lastRenderedPageBreak/>
         <w:t>Acknowledgement</w:t>
@@ -6101,16 +6092,9 @@
     <w:p>
       <w:pPr>
         <w:pStyle w:val="Main-Heading"/>
-        <w:spacing w:before="240"/>
-        <w:rPr>
-          <w:rFonts w:cs="Times New Roman"/>
-        </w:rPr>
       </w:pPr>
       <w:bookmarkStart w:id="2" w:name="_Toc232106212"/>
       <w:r>
-        <w:rPr>
-          <w:rFonts w:cs="Times New Roman"/>
-        </w:rPr>
         <w:lastRenderedPageBreak/>
         <w:t>Overview</w:t>
       </w:r>
@@ -7080,15 +7064,9 @@
     <w:p>
       <w:pPr>
         <w:pStyle w:val="Main-Heading"/>
-        <w:rPr>
-          <w:rFonts w:cs="Times New Roman"/>
-        </w:rPr>
       </w:pPr>
       <w:bookmarkStart w:id="8" w:name="_Toc232106218"/>
       <w:r>
-        <w:rPr>
-          <w:rFonts w:cs="Times New Roman"/>
-        </w:rPr>
         <w:lastRenderedPageBreak/>
         <w:t>Project Aims</w:t>
       </w:r>
@@ -7298,15 +7276,9 @@
     <w:p>
       <w:pPr>
         <w:pStyle w:val="Main-Heading"/>
-        <w:rPr>
-          <w:rFonts w:cs="Times New Roman"/>
-        </w:rPr>
       </w:pPr>
       <w:bookmarkStart w:id="9" w:name="_Toc232106219"/>
       <w:r>
-        <w:rPr>
-          <w:rFonts w:cs="Times New Roman"/>
-        </w:rPr>
         <w:lastRenderedPageBreak/>
         <w:t>Project Objectives</w:t>
       </w:r>
@@ -7704,15 +7676,9 @@
     <w:p>
       <w:pPr>
         <w:pStyle w:val="Main-Heading"/>
-        <w:rPr>
-          <w:rFonts w:cs="Times New Roman"/>
-        </w:rPr>
       </w:pPr>
       <w:bookmarkStart w:id="10" w:name="_Toc232106220"/>
       <w:r>
-        <w:rPr>
-          <w:rFonts w:cs="Times New Roman"/>
-        </w:rPr>
         <w:lastRenderedPageBreak/>
         <w:t>Project Scope</w:t>
       </w:r>
@@ -9607,15 +9573,9 @@
     <w:p>
       <w:pPr>
         <w:pStyle w:val="Main-Heading"/>
-        <w:rPr>
-          <w:rFonts w:cs="Times New Roman"/>
-        </w:rPr>
       </w:pPr>
       <w:bookmarkStart w:id="21" w:name="_Toc232106224"/>
       <w:r>
-        <w:rPr>
-          <w:rFonts w:cs="Times New Roman"/>
-        </w:rPr>
         <w:lastRenderedPageBreak/>
         <w:t>Project Schedule</w:t>
       </w:r>
@@ -10334,6 +10294,611 @@
         <w:t>.</w:t>
       </w:r>
     </w:p>
+    <w:tbl>
+      <w:tblPr>
+        <w:tblStyle w:val="TableGrid"/>
+        <w:tblW w:w="0" w:type="auto"/>
+        <w:tblLook w:val="04A0" w:firstRow="1" w:lastRow="0" w:firstColumn="1" w:lastColumn="0" w:noHBand="0" w:noVBand="1"/>
+      </w:tblPr>
+      <w:tblGrid>
+        <w:gridCol w:w="715"/>
+        <w:gridCol w:w="3793"/>
+        <w:gridCol w:w="2057"/>
+        <w:gridCol w:w="2451"/>
+      </w:tblGrid>
+      <w:tr>
+        <w:tc>
+          <w:tcPr>
+            <w:tcW w:w="715" w:type="dxa"/>
+          </w:tcPr>
+          <w:p>
+            <w:pPr>
+              <w:spacing w:line="360" w:lineRule="auto"/>
+              <w:jc w:val="both"/>
+              <w:rPr>
+                <w:rFonts w:cs="Times New Roman"/>
+              </w:rPr>
+            </w:pPr>
+            <w:r>
+              <w:rPr>
+                <w:rFonts w:cs="Times New Roman"/>
+              </w:rPr>
+              <w:t>S.no</w:t>
+            </w:r>
+          </w:p>
+        </w:tc>
+        <w:tc>
+          <w:tcPr>
+            <w:tcW w:w="3793" w:type="dxa"/>
+          </w:tcPr>
+          <w:p>
+            <w:pPr>
+              <w:spacing w:line="360" w:lineRule="auto"/>
+              <w:jc w:val="both"/>
+              <w:rPr>
+                <w:rFonts w:cs="Times New Roman"/>
+              </w:rPr>
+            </w:pPr>
+            <w:r>
+              <w:rPr>
+                <w:rFonts w:cs="Times New Roman"/>
+              </w:rPr>
+              <w:t>Milestones</w:t>
+            </w:r>
+          </w:p>
+        </w:tc>
+        <w:tc>
+          <w:tcPr>
+            <w:tcW w:w="2057" w:type="dxa"/>
+          </w:tcPr>
+          <w:p>
+            <w:pPr>
+              <w:spacing w:line="360" w:lineRule="auto"/>
+              <w:jc w:val="both"/>
+              <w:rPr>
+                <w:rFonts w:cs="Times New Roman"/>
+              </w:rPr>
+            </w:pPr>
+            <w:r>
+              <w:rPr>
+                <w:rFonts w:cs="Times New Roman"/>
+              </w:rPr>
+              <w:t>Target Date</w:t>
+            </w:r>
+          </w:p>
+        </w:tc>
+        <w:tc>
+          <w:tcPr>
+            <w:tcW w:w="2451" w:type="dxa"/>
+          </w:tcPr>
+          <w:p>
+            <w:pPr>
+              <w:spacing w:line="360" w:lineRule="auto"/>
+              <w:jc w:val="both"/>
+              <w:rPr>
+                <w:rFonts w:cs="Times New Roman"/>
+              </w:rPr>
+            </w:pPr>
+            <w:r>
+              <w:rPr>
+                <w:rFonts w:cs="Times New Roman"/>
+              </w:rPr>
+              <w:t>Criteria for Completion</w:t>
+            </w:r>
+          </w:p>
+        </w:tc>
+      </w:tr>
+      <w:tr>
+        <w:tc>
+          <w:tcPr>
+            <w:tcW w:w="715" w:type="dxa"/>
+          </w:tcPr>
+          <w:p>
+            <w:pPr>
+              <w:spacing w:line="360" w:lineRule="auto"/>
+              <w:jc w:val="both"/>
+              <w:rPr>
+                <w:rFonts w:cs="Times New Roman"/>
+              </w:rPr>
+            </w:pPr>
+            <w:r>
+              <w:rPr>
+                <w:rFonts w:cs="Times New Roman"/>
+              </w:rPr>
+              <w:t>M1</w:t>
+            </w:r>
+          </w:p>
+        </w:tc>
+        <w:tc>
+          <w:tcPr>
+            <w:tcW w:w="3793" w:type="dxa"/>
+          </w:tcPr>
+          <w:p>
+            <w:pPr>
+              <w:spacing w:line="360" w:lineRule="auto"/>
+              <w:jc w:val="both"/>
+              <w:rPr>
+                <w:rFonts w:cs="Times New Roman"/>
+              </w:rPr>
+            </w:pPr>
+            <w:r>
+              <w:rPr>
+                <w:rFonts w:cs="Times New Roman"/>
+              </w:rPr>
+              <w:t>Project Proposal Submission (Task 1)</w:t>
+            </w:r>
+          </w:p>
+        </w:tc>
+        <w:tc>
+          <w:tcPr>
+            <w:tcW w:w="2057" w:type="dxa"/>
+          </w:tcPr>
+          <w:p>
+            <w:pPr>
+              <w:spacing w:line="360" w:lineRule="auto"/>
+              <w:jc w:val="both"/>
+              <w:rPr>
+                <w:rFonts w:cs="Times New Roman"/>
+              </w:rPr>
+            </w:pPr>
+            <w:r>
+              <w:rPr>
+                <w:rFonts w:cs="Times New Roman"/>
+              </w:rPr>
+              <w:t>12</w:t>
+            </w:r>
+            <w:r>
+              <w:rPr>
+                <w:rFonts w:cs="Times New Roman"/>
+                <w:vertAlign w:val="superscript"/>
+              </w:rPr>
+              <w:t>th</w:t>
+            </w:r>
+            <w:r>
+              <w:rPr>
+                <w:rFonts w:cs="Times New Roman"/>
+              </w:rPr>
+              <w:t xml:space="preserve"> June, 2026</w:t>
+            </w:r>
+          </w:p>
+        </w:tc>
+        <w:tc>
+          <w:tcPr>
+            <w:tcW w:w="2451" w:type="dxa"/>
+          </w:tcPr>
+          <w:p>
+            <w:pPr>
+              <w:spacing w:line="360" w:lineRule="auto"/>
+              <w:jc w:val="both"/>
+              <w:rPr>
+                <w:rFonts w:cs="Times New Roman"/>
+              </w:rPr>
+            </w:pPr>
+            <w:r>
+              <w:rPr>
+                <w:rFonts w:cs="Times New Roman"/>
+              </w:rPr>
+              <w:t xml:space="preserve">Task 1 document submitted on HLMS </w:t>
+            </w:r>
+            <w:r>
+              <w:rPr>
+                <w:rFonts w:cs="Times New Roman"/>
+              </w:rPr>
+              <w:lastRenderedPageBreak/>
+              <w:t>with all required sections completed.</w:t>
+            </w:r>
+          </w:p>
+        </w:tc>
+      </w:tr>
+      <w:tr>
+        <w:tc>
+          <w:tcPr>
+            <w:tcW w:w="715" w:type="dxa"/>
+          </w:tcPr>
+          <w:p>
+            <w:pPr>
+              <w:spacing w:line="360" w:lineRule="auto"/>
+              <w:jc w:val="both"/>
+              <w:rPr>
+                <w:rFonts w:cs="Times New Roman"/>
+              </w:rPr>
+            </w:pPr>
+            <w:r>
+              <w:rPr>
+                <w:rFonts w:cs="Times New Roman"/>
+              </w:rPr>
+              <w:lastRenderedPageBreak/>
+              <w:t>M2</w:t>
+            </w:r>
+          </w:p>
+        </w:tc>
+        <w:tc>
+          <w:tcPr>
+            <w:tcW w:w="3793" w:type="dxa"/>
+          </w:tcPr>
+          <w:p>
+            <w:pPr>
+              <w:spacing w:line="360" w:lineRule="auto"/>
+              <w:jc w:val="both"/>
+              <w:rPr>
+                <w:rFonts w:cs="Times New Roman"/>
+              </w:rPr>
+            </w:pPr>
+            <w:r>
+              <w:rPr>
+                <w:rFonts w:cs="Times New Roman"/>
+              </w:rPr>
+              <w:t xml:space="preserve">Requirement Specification and Design </w:t>
+            </w:r>
+            <w:proofErr w:type="gramStart"/>
+            <w:r>
+              <w:rPr>
+                <w:rFonts w:cs="Times New Roman"/>
+              </w:rPr>
+              <w:t>Submission</w:t>
+            </w:r>
+            <w:r>
+              <w:rPr>
+                <w:rFonts w:cs="Times New Roman"/>
+              </w:rPr>
+              <w:t>(</w:t>
+            </w:r>
+            <w:proofErr w:type="gramEnd"/>
+            <w:r>
+              <w:rPr>
+                <w:rFonts w:cs="Times New Roman"/>
+              </w:rPr>
+              <w:t>Task 2</w:t>
+            </w:r>
+            <w:r>
+              <w:rPr>
+                <w:rFonts w:cs="Times New Roman"/>
+              </w:rPr>
+              <w:t>)</w:t>
+            </w:r>
+          </w:p>
+        </w:tc>
+        <w:tc>
+          <w:tcPr>
+            <w:tcW w:w="2057" w:type="dxa"/>
+          </w:tcPr>
+          <w:p>
+            <w:pPr>
+              <w:spacing w:line="360" w:lineRule="auto"/>
+              <w:jc w:val="both"/>
+              <w:rPr>
+                <w:rFonts w:cs="Times New Roman"/>
+              </w:rPr>
+            </w:pPr>
+            <w:r>
+              <w:rPr>
+                <w:rFonts w:cs="Times New Roman"/>
+              </w:rPr>
+              <w:t>25</w:t>
+            </w:r>
+            <w:r>
+              <w:rPr>
+                <w:rFonts w:cs="Times New Roman"/>
+                <w:vertAlign w:val="superscript"/>
+              </w:rPr>
+              <w:t>th</w:t>
+            </w:r>
+            <w:r>
+              <w:rPr>
+                <w:rFonts w:cs="Times New Roman"/>
+              </w:rPr>
+              <w:t xml:space="preserve"> June, 2026</w:t>
+            </w:r>
+          </w:p>
+        </w:tc>
+        <w:tc>
+          <w:tcPr>
+            <w:tcW w:w="2451" w:type="dxa"/>
+          </w:tcPr>
+          <w:p>
+            <w:pPr>
+              <w:spacing w:line="360" w:lineRule="auto"/>
+              <w:jc w:val="both"/>
+              <w:rPr>
+                <w:rFonts w:cs="Times New Roman"/>
+              </w:rPr>
+            </w:pPr>
+            <w:r>
+              <w:rPr>
+                <w:rFonts w:cs="Times New Roman"/>
+              </w:rPr>
+              <w:t xml:space="preserve">Both functional and Non function requirements are met alongside user </w:t>
+            </w:r>
+            <w:proofErr w:type="gramStart"/>
+            <w:r>
+              <w:rPr>
+                <w:rFonts w:cs="Times New Roman"/>
+              </w:rPr>
+              <w:t>stories  &amp;</w:t>
+            </w:r>
+            <w:proofErr w:type="gramEnd"/>
+            <w:r>
+              <w:rPr>
+                <w:rFonts w:cs="Times New Roman"/>
+              </w:rPr>
+              <w:t xml:space="preserve"> Acceptance Criteria and System Designs.</w:t>
+            </w:r>
+          </w:p>
+        </w:tc>
+      </w:tr>
+      <w:tr>
+        <w:tc>
+          <w:tcPr>
+            <w:tcW w:w="715" w:type="dxa"/>
+          </w:tcPr>
+          <w:p>
+            <w:pPr>
+              <w:spacing w:line="360" w:lineRule="auto"/>
+              <w:jc w:val="both"/>
+              <w:rPr>
+                <w:rFonts w:cs="Times New Roman"/>
+              </w:rPr>
+            </w:pPr>
+            <w:r>
+              <w:rPr>
+                <w:rFonts w:cs="Times New Roman"/>
+              </w:rPr>
+              <w:t>M3</w:t>
+            </w:r>
+          </w:p>
+        </w:tc>
+        <w:tc>
+          <w:tcPr>
+            <w:tcW w:w="3793" w:type="dxa"/>
+          </w:tcPr>
+          <w:p>
+            <w:pPr>
+              <w:spacing w:line="360" w:lineRule="auto"/>
+              <w:jc w:val="both"/>
+              <w:rPr>
+                <w:rFonts w:cs="Times New Roman"/>
+              </w:rPr>
+            </w:pPr>
+            <w:r>
+              <w:rPr>
+                <w:rFonts w:cs="Times New Roman"/>
+              </w:rPr>
+              <w:t>Iteration 1 Submission and Presentation</w:t>
+            </w:r>
+          </w:p>
+        </w:tc>
+        <w:tc>
+          <w:tcPr>
+            <w:tcW w:w="2057" w:type="dxa"/>
+          </w:tcPr>
+          <w:p>
+            <w:pPr>
+              <w:spacing w:line="360" w:lineRule="auto"/>
+              <w:jc w:val="both"/>
+              <w:rPr>
+                <w:rFonts w:cs="Times New Roman"/>
+              </w:rPr>
+            </w:pPr>
+            <w:r>
+              <w:rPr>
+                <w:rFonts w:cs="Times New Roman"/>
+              </w:rPr>
+              <w:t>15</w:t>
+            </w:r>
+            <w:r>
+              <w:rPr>
+                <w:rFonts w:cs="Times New Roman"/>
+                <w:vertAlign w:val="superscript"/>
+              </w:rPr>
+              <w:t>th</w:t>
+            </w:r>
+            <w:r>
+              <w:rPr>
+                <w:rFonts w:cs="Times New Roman"/>
+              </w:rPr>
+              <w:t xml:space="preserve"> July</w:t>
+            </w:r>
+            <w:r>
+              <w:rPr>
+                <w:rFonts w:cs="Times New Roman"/>
+              </w:rPr>
+              <w:t>, 2026</w:t>
+            </w:r>
+          </w:p>
+        </w:tc>
+        <w:tc>
+          <w:tcPr>
+            <w:tcW w:w="2451" w:type="dxa"/>
+          </w:tcPr>
+          <w:p>
+            <w:pPr>
+              <w:spacing w:line="360" w:lineRule="auto"/>
+              <w:jc w:val="both"/>
+              <w:rPr>
+                <w:rFonts w:cs="Times New Roman"/>
+              </w:rPr>
+            </w:pPr>
+            <w:r>
+              <w:rPr>
+                <w:rFonts w:cs="Times New Roman"/>
+              </w:rPr>
+              <w:t xml:space="preserve">UC1, UC3, UC5 are completed and tested alongside </w:t>
+            </w:r>
+            <w:proofErr w:type="spellStart"/>
+            <w:r>
+              <w:rPr>
+                <w:rFonts w:cs="Times New Roman"/>
+              </w:rPr>
+              <w:t>github</w:t>
+            </w:r>
+            <w:proofErr w:type="spellEnd"/>
+            <w:r>
+              <w:rPr>
+                <w:rFonts w:cs="Times New Roman"/>
+              </w:rPr>
+              <w:t xml:space="preserve"> collaboration.</w:t>
+            </w:r>
+          </w:p>
+        </w:tc>
+      </w:tr>
+      <w:tr>
+        <w:tc>
+          <w:tcPr>
+            <w:tcW w:w="715" w:type="dxa"/>
+          </w:tcPr>
+          <w:p>
+            <w:pPr>
+              <w:spacing w:line="360" w:lineRule="auto"/>
+              <w:jc w:val="both"/>
+              <w:rPr>
+                <w:rFonts w:cs="Times New Roman"/>
+              </w:rPr>
+            </w:pPr>
+            <w:r>
+              <w:rPr>
+                <w:rFonts w:cs="Times New Roman"/>
+              </w:rPr>
+              <w:t>M4</w:t>
+            </w:r>
+          </w:p>
+        </w:tc>
+        <w:tc>
+          <w:tcPr>
+            <w:tcW w:w="3793" w:type="dxa"/>
+          </w:tcPr>
+          <w:p>
+            <w:pPr>
+              <w:spacing w:line="360" w:lineRule="auto"/>
+              <w:jc w:val="both"/>
+              <w:rPr>
+                <w:rFonts w:cs="Times New Roman"/>
+              </w:rPr>
+            </w:pPr>
+            <w:r>
+              <w:rPr>
+                <w:rFonts w:cs="Times New Roman"/>
+              </w:rPr>
+              <w:t xml:space="preserve">Iteration </w:t>
+            </w:r>
+            <w:r>
+              <w:rPr>
+                <w:rFonts w:cs="Times New Roman"/>
+              </w:rPr>
+              <w:t>2</w:t>
+            </w:r>
+            <w:r>
+              <w:rPr>
+                <w:rFonts w:cs="Times New Roman"/>
+              </w:rPr>
+              <w:t xml:space="preserve"> Submission and Presentation</w:t>
+            </w:r>
+          </w:p>
+        </w:tc>
+        <w:tc>
+          <w:tcPr>
+            <w:tcW w:w="2057" w:type="dxa"/>
+          </w:tcPr>
+          <w:p>
+            <w:pPr>
+              <w:spacing w:line="360" w:lineRule="auto"/>
+              <w:jc w:val="both"/>
+              <w:rPr>
+                <w:rFonts w:cs="Times New Roman"/>
+              </w:rPr>
+            </w:pPr>
+            <w:r>
+              <w:rPr>
+                <w:rFonts w:cs="Times New Roman"/>
+              </w:rPr>
+              <w:t>21</w:t>
+            </w:r>
+            <w:r>
+              <w:rPr>
+                <w:rFonts w:cs="Times New Roman"/>
+                <w:vertAlign w:val="superscript"/>
+              </w:rPr>
+              <w:t>st</w:t>
+            </w:r>
+            <w:r>
+              <w:rPr>
+                <w:rFonts w:cs="Times New Roman"/>
+              </w:rPr>
+              <w:t xml:space="preserve"> August, 2026</w:t>
+            </w:r>
+          </w:p>
+        </w:tc>
+        <w:tc>
+          <w:tcPr>
+            <w:tcW w:w="2451" w:type="dxa"/>
+          </w:tcPr>
+          <w:p>
+            <w:pPr>
+              <w:spacing w:line="360" w:lineRule="auto"/>
+              <w:jc w:val="both"/>
+              <w:rPr>
+                <w:rFonts w:cs="Times New Roman"/>
+              </w:rPr>
+            </w:pPr>
+            <w:r>
+              <w:rPr>
+                <w:rFonts w:cs="Times New Roman"/>
+              </w:rPr>
+              <w:t>UC</w:t>
+            </w:r>
+            <w:r>
+              <w:rPr>
+                <w:rFonts w:cs="Times New Roman"/>
+              </w:rPr>
+              <w:t>2</w:t>
+            </w:r>
+            <w:r>
+              <w:rPr>
+                <w:rFonts w:cs="Times New Roman"/>
+              </w:rPr>
+              <w:t>, UC</w:t>
+            </w:r>
+            <w:r>
+              <w:rPr>
+                <w:rFonts w:cs="Times New Roman"/>
+              </w:rPr>
+              <w:t>4</w:t>
+            </w:r>
+            <w:r>
+              <w:rPr>
+                <w:rFonts w:cs="Times New Roman"/>
+              </w:rPr>
+              <w:t>, UC</w:t>
+            </w:r>
+            <w:r>
+              <w:rPr>
+                <w:rFonts w:cs="Times New Roman"/>
+              </w:rPr>
+              <w:t>6</w:t>
+            </w:r>
+            <w:r>
+              <w:rPr>
+                <w:rFonts w:cs="Times New Roman"/>
+              </w:rPr>
+              <w:t xml:space="preserve"> are completed and tested alongside </w:t>
+            </w:r>
+            <w:proofErr w:type="spellStart"/>
+            <w:r>
+              <w:rPr>
+                <w:rFonts w:cs="Times New Roman"/>
+              </w:rPr>
+              <w:t>github</w:t>
+            </w:r>
+            <w:proofErr w:type="spellEnd"/>
+            <w:r>
+              <w:rPr>
+                <w:rFonts w:cs="Times New Roman"/>
+              </w:rPr>
+              <w:t xml:space="preserve"> collaboration.</w:t>
+            </w:r>
+          </w:p>
+        </w:tc>
+      </w:tr>
+    </w:tbl>
     <w:p>
       <w:pPr>
         <w:spacing w:line="360" w:lineRule="auto"/>
@@ -10405,7 +10970,6 @@
           <w:sz w:val="20"/>
           <w:szCs w:val="20"/>
         </w:rPr>
-        <w:lastRenderedPageBreak/>
         <w:t xml:space="preserve">Note: The chart was created using GanttProject, and </w:t>
       </w:r>
       <w:r>
@@ -10452,15 +11016,9 @@
     <w:p>
       <w:pPr>
         <w:pStyle w:val="Main-Heading"/>
-        <w:rPr>
-          <w:rFonts w:cs="Times New Roman"/>
-        </w:rPr>
       </w:pPr>
       <w:bookmarkStart w:id="30" w:name="_Toc232106228"/>
       <w:r>
-        <w:rPr>
-          <w:rFonts w:cs="Times New Roman"/>
-        </w:rPr>
         <w:t>Technical Description</w:t>
       </w:r>
       <w:bookmarkEnd w:id="30"/>
@@ -10713,6 +11271,7 @@
               <w:rPr>
                 <w:rFonts w:cs="Times New Roman"/>
               </w:rPr>
+              <w:lastRenderedPageBreak/>
               <w:t>Documentation</w:t>
             </w:r>
           </w:p>
@@ -11144,7 +11703,6 @@
                 <w:b/>
                 <w:bCs/>
               </w:rPr>
-              <w:lastRenderedPageBreak/>
               <w:t>Project Management and Collaboration</w:t>
             </w:r>
           </w:p>
@@ -11319,7 +11877,14 @@
               <w:rPr>
                 <w:rFonts w:cs="Times New Roman"/>
               </w:rPr>
-              <w:t>For Team communication, document and resource sharing. Conducting team meeting and discussion.</w:t>
+              <w:t xml:space="preserve">For Team communication, document and resource sharing. Conducting team </w:t>
+            </w:r>
+            <w:r>
+              <w:rPr>
+                <w:rFonts w:cs="Times New Roman"/>
+              </w:rPr>
+              <w:lastRenderedPageBreak/>
+              <w:t>meeting and discussion.</w:t>
             </w:r>
           </w:p>
         </w:tc>
@@ -11346,6 +11911,7 @@
                 <w:b/>
                 <w:bCs/>
               </w:rPr>
+              <w:lastRenderedPageBreak/>
               <w:t>Framework - Frontend</w:t>
             </w:r>
           </w:p>
@@ -11730,7 +12296,6 @@
               <w:rPr>
                 <w:rFonts w:cs="Times New Roman"/>
               </w:rPr>
-              <w:lastRenderedPageBreak/>
               <w:t>Authentication &amp; 2FA</w:t>
             </w:r>
           </w:p>
@@ -11919,6 +12484,7 @@
               <w:rPr>
                 <w:rFonts w:cs="Times New Roman"/>
               </w:rPr>
+              <w:lastRenderedPageBreak/>
               <w:t>All the images, and data and logins details are stored here in the relational database</w:t>
             </w:r>
           </w:p>
@@ -11946,6 +12512,7 @@
                 <w:b/>
                 <w:bCs/>
               </w:rPr>
+              <w:lastRenderedPageBreak/>
               <w:t xml:space="preserve">Hardware </w:t>
             </w:r>
             <w:r>
@@ -13051,15 +13618,9 @@
     <w:p>
       <w:pPr>
         <w:pStyle w:val="Main-Heading"/>
-        <w:rPr>
-          <w:rFonts w:cs="Times New Roman"/>
-        </w:rPr>
       </w:pPr>
       <w:bookmarkStart w:id="34" w:name="_Toc232106231"/>
       <w:r>
-        <w:rPr>
-          <w:rFonts w:cs="Times New Roman"/>
-        </w:rPr>
         <w:lastRenderedPageBreak/>
         <w:t>Risk Management Plan</w:t>
       </w:r>
@@ -13618,6 +14179,7 @@
               <w:rPr>
                 <w:rFonts w:cs="Times New Roman"/>
               </w:rPr>
+              <w:lastRenderedPageBreak/>
               <w:t>Technical Knowledge Gap</w:t>
             </w:r>
           </w:p>
@@ -13927,6 +14489,7 @@
               <w:rPr>
                 <w:rFonts w:cs="Times New Roman"/>
               </w:rPr>
+              <w:lastRenderedPageBreak/>
               <w:t>Security Vulnerability</w:t>
             </w:r>
           </w:p>
@@ -14075,13 +14638,11 @@
             <w:spacing w:before="240" w:line="360" w:lineRule="auto"/>
             <w:rPr>
               <w:rStyle w:val="Main-HeadingChar"/>
-              <w:rFonts w:cs="Times New Roman"/>
             </w:rPr>
           </w:pPr>
           <w:r>
             <w:rPr>
               <w:rStyle w:val="Main-HeadingChar"/>
-              <w:rFonts w:cs="Times New Roman"/>
             </w:rPr>
             <w:t>Works Cited</w:t>
           </w:r>
@@ -14180,16 +14741,10 @@
           <w:ilvl w:val="0"/>
           <w:numId w:val="0"/>
         </w:numPr>
-        <w:ind w:left="360" w:hanging="360"/>
-        <w:rPr>
-          <w:rFonts w:cs="Times New Roman"/>
-        </w:rPr>
+        <w:ind w:left="360"/>
       </w:pPr>
       <w:bookmarkStart w:id="36" w:name="_Toc232106233"/>
       <w:r>
-        <w:rPr>
-          <w:rFonts w:cs="Times New Roman"/>
-        </w:rPr>
         <w:lastRenderedPageBreak/>
         <w:t>Appendices</w:t>
       </w:r>
@@ -16705,7 +17260,7 @@
   <w:abstractNum w:abstractNumId="19" w15:restartNumberingAfterBreak="0">
     <w:nsid w:val="689C666C"/>
     <w:multiLevelType w:val="multilevel"/>
-    <w:tmpl w:val="9CC47CAA"/>
+    <w:tmpl w:val="7B7258BC"/>
     <w:lvl w:ilvl="0">
       <w:start w:val="1"/>
       <w:numFmt w:val="decimal"/>
@@ -18209,7 +18764,6 @@
   <w:style w:type="character" w:default="1" w:styleId="DefaultParagraphFont">
     <w:name w:val="Default Paragraph Font"/>
     <w:uiPriority w:val="1"/>
-    <w:semiHidden/>
     <w:unhideWhenUsed/>
   </w:style>
   <w:style w:type="table" w:default="1" w:styleId="TableNormal">
@@ -18239,7 +18793,7 @@
     <w:link w:val="Main-HeadingChar"/>
     <w:autoRedefine/>
     <w:qFormat/>
-    <w:rsid w:val="00A6422C"/>
+    <w:rsid w:val="00BA3AE4"/>
     <w:pPr>
       <w:numPr>
         <w:numId w:val="5"/>
@@ -18248,23 +18802,24 @@
       <w:ind w:left="360" w:hanging="360"/>
     </w:pPr>
     <w:rPr>
-      <w:rFonts w:ascii="Times New Roman" w:hAnsi="Times New Roman"/>
+      <w:rFonts w:ascii="Times New Roman" w:hAnsi="Times New Roman" w:cs="Times New Roman"/>
       <w:b/>
       <w:color w:val="000000" w:themeColor="text1"/>
-      <w:sz w:val="28"/>
+      <w:sz w:val="24"/>
+      <w:szCs w:val="24"/>
     </w:rPr>
   </w:style>
   <w:style w:type="character" w:customStyle="1" w:styleId="Main-HeadingChar">
     <w:name w:val="Main-Heading Char"/>
     <w:basedOn w:val="Heading1Char"/>
     <w:link w:val="Main-Heading"/>
-    <w:rsid w:val="00A6422C"/>
+    <w:rsid w:val="00BA3AE4"/>
     <w:rPr>
-      <w:rFonts w:ascii="Times New Roman" w:eastAsiaTheme="majorEastAsia" w:hAnsi="Times New Roman" w:cstheme="majorBidi"/>
+      <w:rFonts w:ascii="Times New Roman" w:eastAsiaTheme="majorEastAsia" w:hAnsi="Times New Roman" w:cs="Times New Roman"/>
       <w:b/>
       <w:color w:val="000000" w:themeColor="text1"/>
-      <w:sz w:val="28"/>
-      <w:szCs w:val="40"/>
+      <w:sz w:val="24"/>
+      <w:szCs w:val="24"/>
     </w:rPr>
   </w:style>
   <w:style w:type="character" w:customStyle="1" w:styleId="Heading1Char">

</xml_diff>

<commit_message>
final changes done before submission
</commit_message>
<xml_diff>
--- a/Report/zerowaste_business_plan.docx
+++ b/Report/zerowaste_business_plan.docx
@@ -10041,7 +10041,6 @@
         <w:jc w:val="center"/>
         <w:rPr>
           <w:rFonts w:cs="Times New Roman"/>
-          <w:lang w:val="en-US"/>
         </w:rPr>
       </w:pPr>
       <w:bookmarkStart w:id="27" w:name="_Toc232149898"/>
@@ -10089,6 +10088,68 @@
         <w:t>: Overall WBS Hierarchy</w:t>
       </w:r>
       <w:bookmarkEnd w:id="27"/>
+    </w:p>
+    <w:p>
+      <w:pPr>
+        <w:spacing w:line="360" w:lineRule="auto"/>
+        <w:rPr>
+          <w:rFonts w:cs="Times New Roman"/>
+          <w:i/>
+          <w:iCs/>
+          <w:sz w:val="20"/>
+          <w:szCs w:val="20"/>
+        </w:rPr>
+      </w:pPr>
+      <w:r>
+        <w:rPr>
+          <w:rFonts w:cs="Times New Roman"/>
+          <w:i/>
+          <w:iCs/>
+          <w:sz w:val="20"/>
+          <w:szCs w:val="20"/>
+        </w:rPr>
+        <w:t xml:space="preserve">Note: The chart was created using </w:t>
+      </w:r>
+      <w:r>
+        <w:rPr>
+          <w:rFonts w:cs="Times New Roman"/>
+          <w:i/>
+          <w:iCs/>
+          <w:sz w:val="20"/>
+          <w:szCs w:val="20"/>
+        </w:rPr>
+        <w:t>draw.io</w:t>
+      </w:r>
+      <w:r>
+        <w:rPr>
+          <w:rFonts w:cs="Times New Roman"/>
+          <w:i/>
+          <w:iCs/>
+          <w:sz w:val="20"/>
+          <w:szCs w:val="20"/>
+        </w:rPr>
+        <w:t>, and the</w:t>
+      </w:r>
+      <w:r>
+        <w:rPr>
+          <w:rFonts w:cs="Times New Roman"/>
+          <w:i/>
+          <w:iCs/>
+          <w:sz w:val="20"/>
+          <w:szCs w:val="20"/>
+        </w:rPr>
+        <w:t xml:space="preserve"> .io</w:t>
+      </w:r>
+      <w:r>
+        <w:rPr>
+          <w:rFonts w:cs="Times New Roman"/>
+          <w:i/>
+          <w:iCs/>
+          <w:sz w:val="20"/>
+          <w:szCs w:val="20"/>
+        </w:rPr>
+        <w:t xml:space="preserve"> project file is maintained in the team’s GitHub repository.</w:t>
+      </w:r>
     </w:p>
     <w:p>
       <w:pPr>
@@ -24382,7 +24443,7 @@
   <w:style w:type="paragraph" w:default="1" w:styleId="Normal">
     <w:name w:val="Normal"/>
     <w:qFormat/>
-    <w:rsid w:val="00BF2EFE"/>
+    <w:rsid w:val="001D1709"/>
     <w:rPr>
       <w:rFonts w:ascii="Times New Roman" w:hAnsi="Times New Roman"/>
       <w:sz w:val="24"/>

</xml_diff>